<commit_message>
fix(templates): restore correct version of template_strd.docx
</commit_message>
<xml_diff>
--- a/rusun-backend/app/templates/template_strd.docx
+++ b/rusun-backend/app/templates/template_strd.docx
@@ -1,6 +1,6 @@
 
 <file path=word/document.xml><?xml version="1.0" encoding="utf-8"?>
-<w:document xmlns:wpc="http://schemas.microsoft.com/office/word/2010/wordprocessingCanvas" xmlns:cx="http://schemas.microsoft.com/office/drawing/2014/chartex" xmlns:cx1="http://schemas.microsoft.com/office/drawing/2015/9/8/chartex" xmlns:cx2="http://schemas.microsoft.com/office/drawing/2015/10/21/chartex" xmlns:cx3="http://schemas.microsoft.com/office/drawing/2016/5/9/chartex" xmlns:cx4="http://schemas.microsoft.com/office/drawing/2016/5/10/chartex" xmlns:cx5="http://schemas.microsoft.com/office/drawing/2016/5/11/chartex" xmlns:cx6="http://schemas.microsoft.com/office/drawing/2016/5/12/chartex" xmlns:cx7="http://schemas.microsoft.com/office/drawing/2016/5/13/chartex" xmlns:cx8="http://schemas.microsoft.com/office/drawing/2016/5/14/chartex" xmlns:mc="http://schemas.openxmlformats.org/markup-compatibility/2006" xmlns:aink="http://schemas.microsoft.com/office/drawing/2016/ink" xmlns:am3d="http://schemas.microsoft.com/office/drawing/2017/model3d" xmlns:o="urn:schemas-microsoft-com:office:office" xmlns:oel="http://schemas.microsoft.com/office/2019/extlst" xmlns:r="http://schemas.openxmlformats.org/officeDocument/2006/relationships" xmlns:m="http://schemas.openxmlformats.org/officeDocument/2006/math" xmlns:v="urn:schemas-microsoft-com:vml" xmlns:wp14="http://schemas.microsoft.com/office/word/2010/wordprocessingDrawing" xmlns:wp="http://schemas.openxmlformats.org/drawingml/2006/wordprocessingDrawing" xmlns:w10="urn:schemas-microsoft-com:office:word" xmlns:w="http://schemas.openxmlformats.org/wordprocessingml/2006/main" xmlns:w14="http://schemas.microsoft.com/office/word/2010/wordml" xmlns:w15="http://schemas.microsoft.com/office/word/2012/wordml" xmlns:w16cex="http://schemas.microsoft.com/office/word/2018/wordml/cex" xmlns:w16cid="http://schemas.microsoft.com/office/word/2016/wordml/cid" xmlns:w16="http://schemas.microsoft.com/office/word/2018/wordml" xmlns:w16du="http://schemas.microsoft.com/office/word/2023/wordml/word16du" xmlns:w16sdtdh="http://schemas.microsoft.com/office/word/2020/wordml/sdtdatahash" xmlns:w16sdtfl="http://schemas.microsoft.com/office/word/2024/wordml/sdtformatlock" xmlns:w16se="http://schemas.microsoft.com/office/word/2015/wordml/symex" xmlns:wpg="http://schemas.microsoft.com/office/word/2010/wordprocessingGroup" xmlns:wpi="http://schemas.microsoft.com/office/word/2010/wordprocessingInk" xmlns:wne="http://schemas.microsoft.com/office/word/2006/wordml" xmlns:wps="http://schemas.microsoft.com/office/word/2010/wordprocessingShape" mc:Ignorable="w14 w15 w16se w16cid w16 w16cex w16sdtdh w16sdtfl w16du wp14">
+<w:document xmlns:wpc="http://schemas.microsoft.com/office/word/2010/wordprocessingCanvas" xmlns:cx="http://schemas.microsoft.com/office/drawing/2014/chartex" xmlns:cx1="http://schemas.microsoft.com/office/drawing/2015/9/8/chartex" xmlns:cx2="http://schemas.microsoft.com/office/drawing/2015/10/21/chartex" xmlns:cx3="http://schemas.microsoft.com/office/drawing/2016/5/9/chartex" xmlns:cx4="http://schemas.microsoft.com/office/drawing/2016/5/10/chartex" xmlns:cx5="http://schemas.microsoft.com/office/drawing/2016/5/11/chartex" xmlns:cx6="http://schemas.microsoft.com/office/drawing/2016/5/12/chartex" xmlns:cx7="http://schemas.microsoft.com/office/drawing/2016/5/13/chartex" xmlns:cx8="http://schemas.microsoft.com/office/drawing/2016/5/14/chartex" xmlns:mc="http://schemas.openxmlformats.org/markup-compatibility/2006" xmlns:aink="http://schemas.microsoft.com/office/drawing/2016/ink" xmlns:am3d="http://schemas.microsoft.com/office/drawing/2017/model3d" xmlns:o="urn:schemas-microsoft-com:office:office" xmlns:r="http://schemas.openxmlformats.org/officeDocument/2006/relationships" xmlns:m="http://schemas.openxmlformats.org/officeDocument/2006/math" xmlns:v="urn:schemas-microsoft-com:vml" xmlns:wp14="http://schemas.microsoft.com/office/word/2010/wordprocessingDrawing" xmlns:wp="http://schemas.openxmlformats.org/drawingml/2006/wordprocessingDrawing" xmlns:w10="urn:schemas-microsoft-com:office:word" xmlns:w="http://schemas.openxmlformats.org/wordprocessingml/2006/main" xmlns:w14="http://schemas.microsoft.com/office/word/2010/wordml" xmlns:w15="http://schemas.microsoft.com/office/word/2012/wordml" xmlns:w16cex="http://schemas.microsoft.com/office/word/2018/wordml/cex" xmlns:w16cid="http://schemas.microsoft.com/office/word/2016/wordml/cid" xmlns:w16="http://schemas.microsoft.com/office/word/2018/wordml" xmlns:w16sdtdh="http://schemas.microsoft.com/office/word/2020/wordml/sdtdatahash" xmlns:w16se="http://schemas.microsoft.com/office/word/2015/wordml/symex" xmlns:wpg="http://schemas.microsoft.com/office/word/2010/wordprocessingGroup" xmlns:wpi="http://schemas.microsoft.com/office/word/2010/wordprocessingInk" xmlns:wne="http://schemas.microsoft.com/office/word/2006/wordml" xmlns:wps="http://schemas.microsoft.com/office/word/2010/wordprocessingShape" mc:Ignorable="w14 w15 w16se w16cid w16 w16cex w16sdtdh wp14">
   <w:body>
     <w:p>
       <w:pPr>
@@ -43,10 +43,10 @@
             <v:path o:extrusionok="f" gradientshapeok="t" o:connecttype="rect"/>
             <o:lock v:ext="edit" aspectratio="t"/>
           </v:shapetype>
-          <v:shape id="_x0000_s1059" type="#_x0000_t75" style="position:absolute;left:0;text-align:left;margin-left:34.5pt;margin-top:-58.75pt;width:64pt;height:70.45pt;z-index:251657216;visibility:visible;mso-wrap-style:tight;mso-wrap-edited:f">
+          <v:shape id="_x0000_s1059" type="#_x0000_t75" style="position:absolute;left:0;text-align:left;margin-left:38.2pt;margin-top:-61.65pt;width:64pt;height:70.45pt;z-index:251657216;visibility:visible;mso-wrap-style:tight;mso-wrap-edited:f">
             <v:imagedata r:id="rId8" o:title=""/>
           </v:shape>
-          <o:OLEObject Type="Embed" ProgID="Word.Document.12" ShapeID="_x0000_s1059" DrawAspect="Content" ObjectID="_1837164136" r:id="rId9"/>
+          <o:OLEObject Type="Embed" ProgID="Word.Document.12" ShapeID="_x0000_s1059" DrawAspect="Content" ObjectID="_1837182553" r:id="rId9"/>
         </w:object>
       </w:r>
       <w:r>
@@ -60,38 +60,16 @@
           <w:lang w:val="en-US"/>
         </w:rPr>
         <w:object w:dxaOrig="1440" w:dyaOrig="1440" w14:anchorId="0FB59ABA">
-          <v:shape id="_x0000_s1052" type="#_x0000_t75" style="position:absolute;left:0;text-align:left;margin-left:34.5pt;margin-top:-72.2pt;width:493.95pt;height:88.65pt;z-index:251654144" filled="t">
+          <v:shape id="_x0000_s1052" type="#_x0000_t75" style="position:absolute;left:0;text-align:left;margin-left:38.8pt;margin-top:-74.05pt;width:493.95pt;height:88.65pt;z-index:251654144" filled="t">
             <v:imagedata r:id="rId10" o:title=""/>
           </v:shape>
-          <o:OLEObject Type="Embed" ProgID="Word.Document.12" ShapeID="_x0000_s1052" DrawAspect="Content" ObjectID="_1837164137" r:id="rId11"/>
+          <o:OLEObject Type="Embed" ProgID="Word.Document.12" ShapeID="_x0000_s1052" DrawAspect="Content" ObjectID="_1837182554" r:id="rId11"/>
         </w:object>
-      </w:r>
-      <w:r>
-        <w:rPr>
-          <w:rFonts w:ascii="Tahoma" w:hAnsi="Tahoma" w:cs="Tahoma"/>
-          <w:bCs w:val="0"/>
-          <w:color w:val="000000"/>
-          <w:szCs w:val="26"/>
-          <w:u w:val="single"/>
-          <w:lang w:val="id-ID"/>
-        </w:rPr>
-        <w:t>p</w:t>
-      </w:r>
-      <w:r>
-        <w:rPr>
-          <w:rFonts w:ascii="Tahoma" w:hAnsi="Tahoma" w:cs="Tahoma"/>
-          <w:bCs w:val="0"/>
-          <w:color w:val="000000"/>
-          <w:szCs w:val="26"/>
-          <w:u w:val="single"/>
-        </w:rPr>
-        <w:t xml:space="preserve">  </w:t>
       </w:r>
     </w:p>
     <w:p>
       <w:pPr>
         <w:pStyle w:val="Title"/>
-        <w:spacing w:before="200"/>
         <w:outlineLvl w:val="0"/>
         <w:rPr>
           <w:rFonts w:ascii="Tahoma" w:hAnsi="Tahoma" w:cs="Tahoma"/>
@@ -148,6 +126,7 @@
           <w:szCs w:val="22"/>
         </w:rPr>
       </w:pPr>
+      <w:proofErr w:type="spellStart"/>
       <w:proofErr w:type="gramStart"/>
       <w:r>
         <w:rPr>
@@ -158,7 +137,19 @@
           <w:sz w:val="22"/>
           <w:szCs w:val="22"/>
         </w:rPr>
-        <w:t>Nomor :</w:t>
+        <w:t>Nomor</w:t>
+      </w:r>
+      <w:proofErr w:type="spellEnd"/>
+      <w:r>
+        <w:rPr>
+          <w:rFonts w:ascii="Tahoma" w:hAnsi="Tahoma" w:cs="Tahoma"/>
+          <w:b w:val="0"/>
+          <w:bCs w:val="0"/>
+          <w:color w:val="000000"/>
+          <w:sz w:val="22"/>
+          <w:szCs w:val="22"/>
+        </w:rPr>
+        <w:t xml:space="preserve"> :</w:t>
       </w:r>
       <w:proofErr w:type="gramEnd"/>
       <w:r>
@@ -182,233 +173,19 @@
           <w:szCs w:val="22"/>
           <w:lang w:val="id-ID"/>
         </w:rPr>
-        <w:t>974</w:t>
-      </w:r>
-      <w:r>
-        <w:rPr>
-          <w:rFonts w:ascii="Tahoma" w:hAnsi="Tahoma" w:cs="Tahoma"/>
+        <w:t>{{ nomor_surat }}</w:t>
+      </w:r>
+      <w:r>
+        <w:rPr>
+          <w:rFonts w:ascii="Tahoma" w:hAnsi="Tahoma" w:cs="Tahoma"/>
+          <w:b w:val="0"/>
           <w:bCs w:val="0"/>
-          <w:color w:val="000000"/>
-          <w:sz w:val="18"/>
-          <w:szCs w:val="18"/>
-          <w:lang w:val="en-US"/>
-        </w:rPr>
-        <w:t>/</w:t>
-      </w:r>
-      <w:r>
-        <w:rPr>
-          <w:rFonts w:ascii="Tahoma" w:hAnsi="Tahoma" w:cs="Tahoma"/>
-          <w:b w:val="0"/>
           <w:color w:val="000000"/>
           <w:sz w:val="22"/>
           <w:szCs w:val="22"/>
-          <w:lang w:val="en-US"/>
-        </w:rPr>
-        <w:t>STRD</w:t>
-      </w:r>
-      <w:r>
-        <w:rPr>
-          <w:rFonts w:ascii="Tahoma" w:hAnsi="Tahoma" w:cs="Tahoma"/>
-          <w:color w:val="000000"/>
-          <w:sz w:val="18"/>
-          <w:szCs w:val="18"/>
-        </w:rPr>
-        <w:t>/</w:t>
-      </w:r>
-      <w:r>
-        <w:rPr>
-          <w:rFonts w:ascii="Tahoma" w:hAnsi="Tahoma" w:cs="Tahoma"/>
-          <w:b w:val="0"/>
-          <w:bCs w:val="0"/>
-          <w:color w:val="000000"/>
-          <w:sz w:val="22"/>
-          <w:szCs w:val="22"/>
-        </w:rPr>
-        <w:t>0</w:t>
-      </w:r>
-      <w:r>
-        <w:rPr>
-          <w:rFonts w:ascii="Tahoma" w:hAnsi="Tahoma" w:cs="Tahoma"/>
-          <w:b w:val="0"/>
-          <w:color w:val="000000"/>
-          <w:sz w:val="22"/>
-          <w:szCs w:val="22"/>
-          <w:lang w:val="en-US"/>
-        </w:rPr>
-        <w:t>2</w:t>
-      </w:r>
-      <w:r>
-        <w:rPr>
-          <w:rFonts w:ascii="Tahoma" w:hAnsi="Tahoma" w:cs="Tahoma"/>
-          <w:b w:val="0"/>
-          <w:color w:val="000000"/>
-          <w:sz w:val="22"/>
-          <w:szCs w:val="22"/>
-          <w:lang w:val="en-US"/>
-        </w:rPr>
-        <w:t>.</w:t>
-      </w:r>
-      <w:r>
-        <w:rPr>
-          <w:rFonts w:ascii="Tahoma" w:hAnsi="Tahoma" w:cs="Tahoma"/>
-          <w:b w:val="0"/>
-          <w:color w:val="000000"/>
-          <w:sz w:val="22"/>
-          <w:szCs w:val="22"/>
-          <w:lang w:val="en-US"/>
-        </w:rPr>
-        <w:t xml:space="preserve"> </w:t>
-      </w:r>
-      <w:r>
-        <w:rPr>
-          <w:rFonts w:ascii="Tahoma" w:hAnsi="Tahoma" w:cs="Tahoma"/>
-          <w:b w:val="0"/>
-          <w:color w:val="000000"/>
-          <w:sz w:val="22"/>
-          <w:szCs w:val="22"/>
-          <w:lang w:val="en-US"/>
-        </w:rPr>
-        <w:fldChar w:fldCharType="begin"/>
-      </w:r>
-      <w:r>
-        <w:rPr>
-          <w:rFonts w:ascii="Tahoma" w:hAnsi="Tahoma" w:cs="Tahoma"/>
-          <w:b w:val="0"/>
-          <w:color w:val="000000"/>
-          <w:sz w:val="22"/>
-          <w:szCs w:val="22"/>
-          <w:lang w:val="en-US"/>
-        </w:rPr>
-        <w:instrText xml:space="preserve"> MERGEFIELD Urutan </w:instrText>
-      </w:r>
-      <w:r>
-        <w:rPr>
-          <w:rFonts w:ascii="Tahoma" w:hAnsi="Tahoma" w:cs="Tahoma"/>
-          <w:b w:val="0"/>
-          <w:color w:val="000000"/>
-          <w:sz w:val="22"/>
-          <w:szCs w:val="22"/>
-          <w:lang w:val="en-US"/>
-        </w:rPr>
-        <w:fldChar w:fldCharType="separate"/>
-      </w:r>
-      <w:r>
-        <w:rPr>
-          <w:rFonts w:ascii="Tahoma" w:hAnsi="Tahoma" w:cs="Tahoma"/>
-          <w:noProof/>
-          <w:color w:val="000000"/>
-          <w:sz w:val="22"/>
-          <w:szCs w:val="22"/>
-          <w:lang w:val="en-US"/>
-        </w:rPr>
-        <w:t>367</w:t>
-      </w:r>
-      <w:r>
-        <w:rPr>
-          <w:rFonts w:ascii="Tahoma" w:hAnsi="Tahoma" w:cs="Tahoma"/>
-          <w:b w:val="0"/>
-          <w:color w:val="000000"/>
-          <w:sz w:val="22"/>
-          <w:szCs w:val="22"/>
-          <w:lang w:val="en-US"/>
-        </w:rPr>
-        <w:fldChar w:fldCharType="end"/>
-      </w:r>
-      <w:r>
-        <w:rPr>
-          <w:rFonts w:ascii="Tahoma" w:hAnsi="Tahoma" w:cs="Tahoma"/>
-          <w:color w:val="000000"/>
-          <w:sz w:val="18"/>
-          <w:szCs w:val="18"/>
           <w:lang w:val="id-ID"/>
         </w:rPr>
-        <w:t xml:space="preserve"> </w:t>
-      </w:r>
-      <w:r>
-        <w:rPr>
-          <w:rFonts w:ascii="Tahoma" w:hAnsi="Tahoma" w:cs="Tahoma"/>
-          <w:color w:val="000000"/>
-          <w:sz w:val="18"/>
-          <w:szCs w:val="18"/>
-        </w:rPr>
-        <w:t>/</w:t>
-      </w:r>
-      <w:r>
-        <w:rPr>
-          <w:rFonts w:ascii="Tahoma" w:hAnsi="Tahoma" w:cs="Tahoma"/>
-          <w:b w:val="0"/>
-          <w:bCs w:val="0"/>
-          <w:color w:val="000000"/>
-          <w:sz w:val="22"/>
-          <w:szCs w:val="22"/>
-        </w:rPr>
-        <w:t>UPT</w:t>
-      </w:r>
-      <w:r>
-        <w:rPr>
-          <w:rFonts w:ascii="Tahoma" w:hAnsi="Tahoma" w:cs="Tahoma"/>
-          <w:b w:val="0"/>
-          <w:bCs w:val="0"/>
-          <w:color w:val="000000"/>
-          <w:sz w:val="22"/>
-          <w:szCs w:val="22"/>
-        </w:rPr>
-        <w:t>D</w:t>
-      </w:r>
-      <w:r>
-        <w:rPr>
-          <w:rFonts w:ascii="Tahoma" w:hAnsi="Tahoma" w:cs="Tahoma"/>
-          <w:b w:val="0"/>
-          <w:bCs w:val="0"/>
-          <w:color w:val="000000"/>
-          <w:sz w:val="22"/>
-          <w:szCs w:val="22"/>
-        </w:rPr>
-        <w:t>.RSN</w:t>
-      </w:r>
-      <w:r>
-        <w:rPr>
-          <w:rFonts w:ascii="Tahoma" w:hAnsi="Tahoma" w:cs="Tahoma"/>
-          <w:b w:val="0"/>
-          <w:bCs w:val="0"/>
-          <w:color w:val="000000"/>
-          <w:sz w:val="22"/>
-          <w:szCs w:val="22"/>
-        </w:rPr>
-        <w:t>/</w:t>
-      </w:r>
-      <w:r>
-        <w:rPr>
-          <w:rFonts w:ascii="Tahoma" w:hAnsi="Tahoma" w:cs="Tahoma"/>
-          <w:b w:val="0"/>
-          <w:bCs w:val="0"/>
-          <w:color w:val="000000"/>
-          <w:sz w:val="22"/>
-          <w:szCs w:val="22"/>
-        </w:rPr>
-        <w:t>I</w:t>
-      </w:r>
-      <w:r>
-        <w:rPr>
-          <w:rFonts w:ascii="Tahoma" w:hAnsi="Tahoma" w:cs="Tahoma"/>
-          <w:b w:val="0"/>
-          <w:bCs w:val="0"/>
-          <w:color w:val="000000"/>
-          <w:sz w:val="22"/>
-          <w:szCs w:val="22"/>
-        </w:rPr>
-        <w:t>/202</w:t>
-      </w:r>
-      <w:r>
-        <w:rPr>
-          <w:rFonts w:ascii="Tahoma" w:hAnsi="Tahoma" w:cs="Tahoma"/>
-          <w:b w:val="0"/>
-          <w:bCs w:val="0"/>
-          <w:color w:val="000000"/>
-          <w:sz w:val="22"/>
-          <w:szCs w:val="22"/>
-        </w:rPr>
-        <w:t>6</w:t>
+        <w:tab/>
       </w:r>
     </w:p>
     <w:p>
@@ -429,7 +206,27 @@
           <w:sz w:val="18"/>
           <w:szCs w:val="18"/>
         </w:rPr>
-        <w:t xml:space="preserve">Id Penghuni </w:t>
+        <w:t xml:space="preserve">Id </w:t>
+      </w:r>
+      <w:proofErr w:type="spellStart"/>
+      <w:r>
+        <w:rPr>
+          <w:rFonts w:ascii="Tahoma" w:hAnsi="Tahoma" w:cs="Tahoma"/>
+          <w:color w:val="000000"/>
+          <w:sz w:val="18"/>
+          <w:szCs w:val="18"/>
+        </w:rPr>
+        <w:t>Penghuni</w:t>
+      </w:r>
+      <w:proofErr w:type="spellEnd"/>
+      <w:r>
+        <w:rPr>
+          <w:rFonts w:ascii="Tahoma" w:hAnsi="Tahoma" w:cs="Tahoma"/>
+          <w:color w:val="000000"/>
+          <w:sz w:val="18"/>
+          <w:szCs w:val="18"/>
+        </w:rPr>
+        <w:t xml:space="preserve"> </w:t>
       </w:r>
       <w:r>
         <w:rPr>
@@ -439,6 +236,395 @@
           <w:szCs w:val="18"/>
         </w:rPr>
         <w:tab/>
+      </w:r>
+      <w:r>
+        <w:rPr>
+          <w:rFonts w:ascii="Tahoma" w:hAnsi="Tahoma" w:cs="Tahoma"/>
+          <w:color w:val="000000"/>
+          <w:sz w:val="18"/>
+          <w:szCs w:val="18"/>
+        </w:rPr>
+        <w:tab/>
+        <w:t>:</w:t>
+      </w:r>
+      <w:r>
+        <w:t xml:space="preserve"> </w:t>
+      </w:r>
+      <w:proofErr w:type="gramStart"/>
+      <w:r>
+        <w:rPr>
+          <w:rFonts w:ascii="Tahoma" w:hAnsi="Tahoma" w:cs="Tahoma"/>
+          <w:color w:val="000000"/>
+          <w:sz w:val="18"/>
+          <w:szCs w:val="18"/>
+        </w:rPr>
+        <w:t xml:space="preserve">{{ </w:t>
+      </w:r>
+      <w:proofErr w:type="spellStart"/>
+      <w:r>
+        <w:rPr>
+          <w:rFonts w:ascii="Tahoma" w:hAnsi="Tahoma" w:cs="Tahoma"/>
+          <w:color w:val="000000"/>
+          <w:sz w:val="18"/>
+          <w:szCs w:val="18"/>
+        </w:rPr>
+        <w:t>id</w:t>
+      </w:r>
+      <w:proofErr w:type="gramEnd"/>
+      <w:r>
+        <w:rPr>
+          <w:rFonts w:ascii="Tahoma" w:hAnsi="Tahoma" w:cs="Tahoma"/>
+          <w:color w:val="000000"/>
+          <w:sz w:val="18"/>
+          <w:szCs w:val="18"/>
+        </w:rPr>
+        <w:t>_penghuni</w:t>
+      </w:r>
+      <w:proofErr w:type="spellEnd"/>
+      <w:r>
+        <w:rPr>
+          <w:rFonts w:ascii="Tahoma" w:hAnsi="Tahoma" w:cs="Tahoma"/>
+          <w:color w:val="000000"/>
+          <w:sz w:val="18"/>
+          <w:szCs w:val="18"/>
+        </w:rPr>
+        <w:t xml:space="preserve"> }}</w:t>
+      </w:r>
+    </w:p>
+    <w:p>
+      <w:pPr>
+        <w:ind w:left="1440"/>
+        <w:rPr>
+          <w:rFonts w:ascii="Tahoma" w:hAnsi="Tahoma" w:cs="Tahoma"/>
+          <w:color w:val="000000"/>
+          <w:sz w:val="18"/>
+          <w:szCs w:val="18"/>
+          <w:lang w:val="id-ID"/>
+        </w:rPr>
+      </w:pPr>
+      <w:r>
+        <w:rPr>
+          <w:rFonts w:ascii="Tahoma" w:hAnsi="Tahoma" w:cs="Tahoma"/>
+          <w:color w:val="000000"/>
+          <w:sz w:val="18"/>
+          <w:szCs w:val="18"/>
+        </w:rPr>
+        <w:t>Nama</w:t>
+      </w:r>
+      <w:r>
+        <w:rPr>
+          <w:rFonts w:ascii="Tahoma" w:hAnsi="Tahoma" w:cs="Tahoma"/>
+          <w:color w:val="000000"/>
+          <w:sz w:val="18"/>
+          <w:szCs w:val="18"/>
+        </w:rPr>
+        <w:tab/>
+      </w:r>
+      <w:r>
+        <w:rPr>
+          <w:rFonts w:ascii="Tahoma" w:hAnsi="Tahoma" w:cs="Tahoma"/>
+          <w:color w:val="000000"/>
+          <w:sz w:val="18"/>
+          <w:szCs w:val="18"/>
+        </w:rPr>
+        <w:tab/>
+      </w:r>
+      <w:r>
+        <w:rPr>
+          <w:rFonts w:ascii="Tahoma" w:hAnsi="Tahoma" w:cs="Tahoma"/>
+          <w:color w:val="000000"/>
+          <w:sz w:val="18"/>
+          <w:szCs w:val="18"/>
+        </w:rPr>
+        <w:tab/>
+        <w:t>:</w:t>
+      </w:r>
+      <w:r>
+        <w:rPr>
+          <w:rFonts w:ascii="Tahoma" w:hAnsi="Tahoma" w:cs="Tahoma"/>
+          <w:color w:val="000000"/>
+          <w:sz w:val="18"/>
+          <w:szCs w:val="18"/>
+        </w:rPr>
+        <w:t xml:space="preserve"> </w:t>
+      </w:r>
+      <w:proofErr w:type="gramStart"/>
+      <w:r>
+        <w:rPr>
+          <w:rFonts w:ascii="Tahoma" w:hAnsi="Tahoma" w:cs="Tahoma"/>
+          <w:color w:val="000000"/>
+          <w:sz w:val="18"/>
+          <w:szCs w:val="18"/>
+        </w:rPr>
+        <w:t xml:space="preserve">{{ </w:t>
+      </w:r>
+      <w:proofErr w:type="spellStart"/>
+      <w:r>
+        <w:rPr>
+          <w:rFonts w:ascii="Tahoma" w:hAnsi="Tahoma" w:cs="Tahoma"/>
+          <w:color w:val="000000"/>
+          <w:sz w:val="18"/>
+          <w:szCs w:val="18"/>
+        </w:rPr>
+        <w:t>nama</w:t>
+      </w:r>
+      <w:proofErr w:type="spellEnd"/>
+      <w:proofErr w:type="gramEnd"/>
+      <w:r>
+        <w:rPr>
+          <w:rFonts w:ascii="Tahoma" w:hAnsi="Tahoma" w:cs="Tahoma"/>
+          <w:color w:val="000000"/>
+          <w:sz w:val="18"/>
+          <w:szCs w:val="18"/>
+        </w:rPr>
+        <w:t xml:space="preserve"> }}</w:t>
+      </w:r>
+    </w:p>
+    <w:p>
+      <w:pPr>
+        <w:ind w:left="1440"/>
+        <w:rPr>
+          <w:rFonts w:ascii="Tahoma" w:hAnsi="Tahoma" w:cs="Tahoma"/>
+          <w:color w:val="000000"/>
+          <w:sz w:val="18"/>
+          <w:szCs w:val="18"/>
+        </w:rPr>
+      </w:pPr>
+      <w:r>
+        <w:rPr>
+          <w:rFonts w:ascii="Tahoma" w:hAnsi="Tahoma" w:cs="Tahoma"/>
+          <w:color w:val="000000"/>
+          <w:sz w:val="18"/>
+          <w:szCs w:val="18"/>
+        </w:rPr>
+        <w:t xml:space="preserve">Alamat </w:t>
+      </w:r>
+      <w:proofErr w:type="spellStart"/>
+      <w:r>
+        <w:rPr>
+          <w:rFonts w:ascii="Tahoma" w:hAnsi="Tahoma" w:cs="Tahoma"/>
+          <w:color w:val="000000"/>
+          <w:sz w:val="18"/>
+          <w:szCs w:val="18"/>
+        </w:rPr>
+        <w:t>Hunian</w:t>
+      </w:r>
+      <w:proofErr w:type="spellEnd"/>
+      <w:r>
+        <w:rPr>
+          <w:rFonts w:ascii="Tahoma" w:hAnsi="Tahoma" w:cs="Tahoma"/>
+          <w:color w:val="000000"/>
+          <w:sz w:val="18"/>
+          <w:szCs w:val="18"/>
+        </w:rPr>
+        <w:t xml:space="preserve"> </w:t>
+      </w:r>
+      <w:r>
+        <w:rPr>
+          <w:rFonts w:ascii="Tahoma" w:hAnsi="Tahoma" w:cs="Tahoma"/>
+          <w:color w:val="000000"/>
+          <w:sz w:val="18"/>
+          <w:szCs w:val="18"/>
+        </w:rPr>
+        <w:tab/>
+      </w:r>
+      <w:r>
+        <w:rPr>
+          <w:rFonts w:ascii="Tahoma" w:hAnsi="Tahoma" w:cs="Tahoma"/>
+          <w:color w:val="000000"/>
+          <w:sz w:val="18"/>
+          <w:szCs w:val="18"/>
+        </w:rPr>
+        <w:tab/>
+        <w:t>:</w:t>
+      </w:r>
+      <w:r>
+        <w:rPr>
+          <w:rFonts w:ascii="Tahoma" w:hAnsi="Tahoma" w:cs="Tahoma"/>
+          <w:color w:val="000000"/>
+          <w:sz w:val="18"/>
+          <w:szCs w:val="18"/>
+        </w:rPr>
+        <w:t xml:space="preserve"> </w:t>
+      </w:r>
+      <w:proofErr w:type="gramStart"/>
+      <w:r>
+        <w:rPr>
+          <w:rFonts w:ascii="Tahoma" w:hAnsi="Tahoma" w:cs="Tahoma"/>
+          <w:color w:val="000000"/>
+          <w:sz w:val="18"/>
+          <w:szCs w:val="18"/>
+        </w:rPr>
+        <w:t xml:space="preserve">{{ </w:t>
+      </w:r>
+      <w:proofErr w:type="spellStart"/>
+      <w:r>
+        <w:rPr>
+          <w:rFonts w:ascii="Tahoma" w:hAnsi="Tahoma" w:cs="Tahoma"/>
+          <w:color w:val="000000"/>
+          <w:sz w:val="18"/>
+          <w:szCs w:val="18"/>
+        </w:rPr>
+        <w:t>alamat</w:t>
+      </w:r>
+      <w:proofErr w:type="gramEnd"/>
+      <w:r>
+        <w:rPr>
+          <w:rFonts w:ascii="Tahoma" w:hAnsi="Tahoma" w:cs="Tahoma"/>
+          <w:color w:val="000000"/>
+          <w:sz w:val="18"/>
+          <w:szCs w:val="18"/>
+        </w:rPr>
+        <w:t>_hunian</w:t>
+      </w:r>
+      <w:proofErr w:type="spellEnd"/>
+      <w:r>
+        <w:rPr>
+          <w:rFonts w:ascii="Tahoma" w:hAnsi="Tahoma" w:cs="Tahoma"/>
+          <w:color w:val="000000"/>
+          <w:sz w:val="18"/>
+          <w:szCs w:val="18"/>
+        </w:rPr>
+        <w:t xml:space="preserve"> }}</w:t>
+      </w:r>
+    </w:p>
+    <w:p>
+      <w:pPr>
+        <w:ind w:left="1440"/>
+        <w:rPr>
+          <w:rFonts w:ascii="Tahoma" w:hAnsi="Tahoma" w:cs="Tahoma"/>
+          <w:color w:val="000000"/>
+          <w:sz w:val="18"/>
+          <w:szCs w:val="18"/>
+        </w:rPr>
+      </w:pPr>
+      <w:r>
+        <w:rPr>
+          <w:rFonts w:ascii="Tahoma" w:hAnsi="Tahoma" w:cs="Tahoma"/>
+          <w:color w:val="000000"/>
+          <w:sz w:val="18"/>
+          <w:szCs w:val="18"/>
+        </w:rPr>
+        <w:t xml:space="preserve">Unit </w:t>
+      </w:r>
+      <w:proofErr w:type="spellStart"/>
+      <w:r>
+        <w:rPr>
+          <w:rFonts w:ascii="Tahoma" w:hAnsi="Tahoma" w:cs="Tahoma"/>
+          <w:color w:val="000000"/>
+          <w:sz w:val="18"/>
+          <w:szCs w:val="18"/>
+        </w:rPr>
+        <w:t>Rusunawa</w:t>
+      </w:r>
+      <w:proofErr w:type="spellEnd"/>
+      <w:r>
+        <w:rPr>
+          <w:rFonts w:ascii="Tahoma" w:hAnsi="Tahoma" w:cs="Tahoma"/>
+          <w:color w:val="000000"/>
+          <w:sz w:val="18"/>
+          <w:szCs w:val="18"/>
+        </w:rPr>
+        <w:t xml:space="preserve"> </w:t>
+      </w:r>
+      <w:r>
+        <w:rPr>
+          <w:rFonts w:ascii="Tahoma" w:hAnsi="Tahoma" w:cs="Tahoma"/>
+          <w:color w:val="000000"/>
+          <w:sz w:val="18"/>
+          <w:szCs w:val="18"/>
+        </w:rPr>
+        <w:tab/>
+      </w:r>
+      <w:r>
+        <w:rPr>
+          <w:rFonts w:ascii="Tahoma" w:hAnsi="Tahoma" w:cs="Tahoma"/>
+          <w:color w:val="000000"/>
+          <w:sz w:val="18"/>
+          <w:szCs w:val="18"/>
+        </w:rPr>
+        <w:tab/>
+        <w:t>:</w:t>
+      </w:r>
+      <w:r>
+        <w:rPr>
+          <w:rFonts w:ascii="Tahoma" w:hAnsi="Tahoma" w:cs="Tahoma"/>
+          <w:color w:val="000000"/>
+          <w:sz w:val="18"/>
+          <w:szCs w:val="18"/>
+        </w:rPr>
+        <w:t xml:space="preserve"> </w:t>
+      </w:r>
+      <w:proofErr w:type="gramStart"/>
+      <w:r>
+        <w:rPr>
+          <w:rFonts w:ascii="Tahoma" w:hAnsi="Tahoma" w:cs="Tahoma"/>
+          <w:color w:val="000000"/>
+          <w:sz w:val="18"/>
+          <w:szCs w:val="18"/>
+        </w:rPr>
+        <w:t xml:space="preserve">{{ </w:t>
+      </w:r>
+      <w:proofErr w:type="spellStart"/>
+      <w:r>
+        <w:rPr>
+          <w:rFonts w:ascii="Tahoma" w:hAnsi="Tahoma" w:cs="Tahoma"/>
+          <w:color w:val="000000"/>
+          <w:sz w:val="18"/>
+          <w:szCs w:val="18"/>
+        </w:rPr>
+        <w:t>rusunawa</w:t>
+      </w:r>
+      <w:proofErr w:type="spellEnd"/>
+      <w:proofErr w:type="gramEnd"/>
+      <w:r>
+        <w:rPr>
+          <w:rFonts w:ascii="Tahoma" w:hAnsi="Tahoma" w:cs="Tahoma"/>
+          <w:color w:val="000000"/>
+          <w:sz w:val="18"/>
+          <w:szCs w:val="18"/>
+        </w:rPr>
+        <w:t xml:space="preserve"> }}</w:t>
+      </w:r>
+    </w:p>
+    <w:p>
+      <w:pPr>
+        <w:ind w:left="1440"/>
+        <w:rPr>
+          <w:rFonts w:ascii="Tahoma" w:hAnsi="Tahoma" w:cs="Tahoma"/>
+          <w:color w:val="000000"/>
+          <w:sz w:val="18"/>
+          <w:szCs w:val="18"/>
+        </w:rPr>
+      </w:pPr>
+      <w:r>
+        <w:rPr>
+          <w:rFonts w:ascii="Tahoma" w:hAnsi="Tahoma" w:cs="Tahoma"/>
+          <w:color w:val="000000"/>
+          <w:sz w:val="18"/>
+          <w:szCs w:val="18"/>
+        </w:rPr>
+        <w:t xml:space="preserve">No </w:t>
+      </w:r>
+      <w:proofErr w:type="spellStart"/>
+      <w:r>
+        <w:rPr>
+          <w:rFonts w:ascii="Tahoma" w:hAnsi="Tahoma" w:cs="Tahoma"/>
+          <w:color w:val="000000"/>
+          <w:sz w:val="18"/>
+          <w:szCs w:val="18"/>
+        </w:rPr>
+        <w:t>Rekening</w:t>
+      </w:r>
+      <w:proofErr w:type="spellEnd"/>
+      <w:r>
+        <w:rPr>
+          <w:rFonts w:ascii="Tahoma" w:hAnsi="Tahoma" w:cs="Tahoma"/>
+          <w:color w:val="000000"/>
+          <w:sz w:val="18"/>
+          <w:szCs w:val="18"/>
+        </w:rPr>
+        <w:t xml:space="preserve"> / An </w:t>
       </w:r>
       <w:r>
         <w:rPr>
@@ -458,484 +644,100 @@
           <w:sz w:val="18"/>
           <w:szCs w:val="18"/>
         </w:rPr>
-        <w:fldChar w:fldCharType="begin"/>
-      </w:r>
-      <w:r>
-        <w:rPr>
-          <w:rFonts w:ascii="Tahoma" w:hAnsi="Tahoma" w:cs="Tahoma"/>
-          <w:b/>
-          <w:color w:val="000000"/>
-          <w:sz w:val="18"/>
-          <w:szCs w:val="18"/>
-        </w:rPr>
-        <w:instrText xml:space="preserve"> MERGEFIELD Kode_Hunian </w:instrText>
-      </w:r>
-      <w:r>
-        <w:rPr>
-          <w:rFonts w:ascii="Tahoma" w:hAnsi="Tahoma" w:cs="Tahoma"/>
-          <w:b/>
-          <w:color w:val="000000"/>
-          <w:sz w:val="18"/>
-          <w:szCs w:val="18"/>
-        </w:rPr>
-        <w:fldChar w:fldCharType="separate"/>
-      </w:r>
-      <w:r>
-        <w:rPr>
-          <w:rFonts w:ascii="Tahoma" w:hAnsi="Tahoma" w:cs="Tahoma"/>
-          <w:b/>
-          <w:noProof/>
-          <w:color w:val="000000"/>
-          <w:sz w:val="18"/>
-          <w:szCs w:val="18"/>
-        </w:rPr>
-        <w:t>02040419</w:t>
-      </w:r>
-      <w:r>
-        <w:rPr>
-          <w:rFonts w:ascii="Tahoma" w:hAnsi="Tahoma" w:cs="Tahoma"/>
-          <w:b/>
-          <w:color w:val="000000"/>
-          <w:sz w:val="18"/>
-          <w:szCs w:val="18"/>
-        </w:rPr>
-        <w:fldChar w:fldCharType="end"/>
+        <w:t>0083 0732 92001</w:t>
+      </w:r>
+      <w:r>
+        <w:rPr>
+          <w:rFonts w:ascii="Tahoma" w:hAnsi="Tahoma" w:cs="Tahoma"/>
+          <w:color w:val="000000"/>
+          <w:sz w:val="18"/>
+          <w:szCs w:val="18"/>
+        </w:rPr>
+        <w:t xml:space="preserve">/ </w:t>
+      </w:r>
+      <w:proofErr w:type="spellStart"/>
+      <w:r>
+        <w:rPr>
+          <w:rFonts w:ascii="Tahoma" w:hAnsi="Tahoma" w:cs="Tahoma"/>
+          <w:color w:val="000000"/>
+          <w:sz w:val="18"/>
+          <w:szCs w:val="18"/>
+        </w:rPr>
+        <w:t>Bendahara</w:t>
+      </w:r>
+      <w:proofErr w:type="spellEnd"/>
+      <w:r>
+        <w:rPr>
+          <w:rFonts w:ascii="Tahoma" w:hAnsi="Tahoma" w:cs="Tahoma"/>
+          <w:color w:val="000000"/>
+          <w:sz w:val="18"/>
+          <w:szCs w:val="18"/>
+        </w:rPr>
+        <w:t xml:space="preserve"> </w:t>
+      </w:r>
+      <w:proofErr w:type="spellStart"/>
+      <w:r>
+        <w:rPr>
+          <w:rFonts w:ascii="Tahoma" w:hAnsi="Tahoma" w:cs="Tahoma"/>
+          <w:color w:val="000000"/>
+          <w:sz w:val="18"/>
+          <w:szCs w:val="18"/>
+        </w:rPr>
+        <w:t>Penerimaan</w:t>
+      </w:r>
+      <w:proofErr w:type="spellEnd"/>
+      <w:r>
+        <w:rPr>
+          <w:rFonts w:ascii="Tahoma" w:hAnsi="Tahoma" w:cs="Tahoma"/>
+          <w:color w:val="000000"/>
+          <w:sz w:val="18"/>
+          <w:szCs w:val="18"/>
+        </w:rPr>
+        <w:t xml:space="preserve"> </w:t>
+      </w:r>
+      <w:proofErr w:type="spellStart"/>
+      <w:r>
+        <w:rPr>
+          <w:rFonts w:ascii="Tahoma" w:hAnsi="Tahoma" w:cs="Tahoma"/>
+          <w:color w:val="000000"/>
+          <w:sz w:val="18"/>
+          <w:szCs w:val="18"/>
+        </w:rPr>
+        <w:t>Disperkim</w:t>
+      </w:r>
+      <w:proofErr w:type="spellEnd"/>
+      <w:r>
+        <w:rPr>
+          <w:rFonts w:ascii="Tahoma" w:hAnsi="Tahoma" w:cs="Tahoma"/>
+          <w:color w:val="000000"/>
+          <w:sz w:val="18"/>
+          <w:szCs w:val="18"/>
+        </w:rPr>
+        <w:t xml:space="preserve"> Kota </w:t>
+      </w:r>
+      <w:proofErr w:type="spellStart"/>
+      <w:r>
+        <w:rPr>
+          <w:rFonts w:ascii="Tahoma" w:hAnsi="Tahoma" w:cs="Tahoma"/>
+          <w:color w:val="000000"/>
+          <w:sz w:val="18"/>
+          <w:szCs w:val="18"/>
+        </w:rPr>
+        <w:t>Cimahi</w:t>
+      </w:r>
+      <w:proofErr w:type="spellEnd"/>
+      <w:r>
+        <w:rPr>
+          <w:rFonts w:ascii="Tahoma" w:hAnsi="Tahoma" w:cs="Tahoma"/>
+          <w:color w:val="000000"/>
+          <w:sz w:val="18"/>
+          <w:szCs w:val="18"/>
+        </w:rPr>
+        <w:t xml:space="preserve">  </w:t>
       </w:r>
     </w:p>
     <w:p>
       <w:pPr>
-        <w:ind w:left="1440"/>
-        <w:rPr>
-          <w:rFonts w:ascii="Tahoma" w:hAnsi="Tahoma" w:cs="Tahoma"/>
-          <w:color w:val="000000"/>
-          <w:sz w:val="18"/>
-          <w:szCs w:val="18"/>
-          <w:lang w:val="id-ID"/>
-        </w:rPr>
-      </w:pPr>
-      <w:r>
-        <w:rPr>
-          <w:rFonts w:ascii="Tahoma" w:hAnsi="Tahoma" w:cs="Tahoma"/>
-          <w:color w:val="000000"/>
-          <w:sz w:val="18"/>
-          <w:szCs w:val="18"/>
-        </w:rPr>
-        <w:t>Nama</w:t>
-      </w:r>
-      <w:r>
-        <w:rPr>
-          <w:rFonts w:ascii="Tahoma" w:hAnsi="Tahoma" w:cs="Tahoma"/>
-          <w:color w:val="000000"/>
-          <w:sz w:val="18"/>
-          <w:szCs w:val="18"/>
-        </w:rPr>
-        <w:tab/>
-      </w:r>
-      <w:r>
-        <w:rPr>
-          <w:rFonts w:ascii="Tahoma" w:hAnsi="Tahoma" w:cs="Tahoma"/>
-          <w:color w:val="000000"/>
-          <w:sz w:val="18"/>
-          <w:szCs w:val="18"/>
-        </w:rPr>
-        <w:tab/>
-      </w:r>
-      <w:r>
-        <w:rPr>
-          <w:rFonts w:ascii="Tahoma" w:hAnsi="Tahoma" w:cs="Tahoma"/>
-          <w:color w:val="000000"/>
-          <w:sz w:val="18"/>
-          <w:szCs w:val="18"/>
-        </w:rPr>
-        <w:tab/>
-        <w:t>:</w:t>
-      </w:r>
-      <w:r>
-        <w:rPr>
-          <w:rFonts w:ascii="Tahoma" w:hAnsi="Tahoma" w:cs="Tahoma"/>
-          <w:color w:val="000000"/>
-          <w:sz w:val="18"/>
-          <w:szCs w:val="18"/>
-        </w:rPr>
-        <w:t xml:space="preserve"> </w:t>
-      </w:r>
-      <w:r>
-        <w:rPr>
-          <w:rFonts w:ascii="Tahoma" w:hAnsi="Tahoma" w:cs="Tahoma"/>
-          <w:color w:val="000000"/>
-          <w:sz w:val="18"/>
-          <w:szCs w:val="18"/>
-        </w:rPr>
-        <w:fldChar w:fldCharType="begin"/>
-      </w:r>
-      <w:r>
-        <w:rPr>
-          <w:rFonts w:ascii="Tahoma" w:hAnsi="Tahoma" w:cs="Tahoma"/>
-          <w:color w:val="000000"/>
-          <w:sz w:val="18"/>
-          <w:szCs w:val="18"/>
-        </w:rPr>
-        <w:instrText xml:space="preserve"> MERGEFIELD NAMA__PENGHUNI </w:instrText>
-      </w:r>
-      <w:r>
-        <w:rPr>
-          <w:rFonts w:ascii="Tahoma" w:hAnsi="Tahoma" w:cs="Tahoma"/>
-          <w:color w:val="000000"/>
-          <w:sz w:val="18"/>
-          <w:szCs w:val="18"/>
-        </w:rPr>
-        <w:fldChar w:fldCharType="separate"/>
-      </w:r>
-      <w:r>
-        <w:rPr>
-          <w:rFonts w:ascii="Tahoma" w:hAnsi="Tahoma" w:cs="Tahoma"/>
-          <w:noProof/>
-          <w:color w:val="000000"/>
-          <w:sz w:val="18"/>
-          <w:szCs w:val="18"/>
-        </w:rPr>
-        <w:t>Dian pertiwi (lala)</w:t>
-      </w:r>
-      <w:r>
-        <w:rPr>
-          <w:rFonts w:ascii="Tahoma" w:hAnsi="Tahoma" w:cs="Tahoma"/>
-          <w:color w:val="000000"/>
-          <w:sz w:val="18"/>
-          <w:szCs w:val="18"/>
-        </w:rPr>
-        <w:fldChar w:fldCharType="end"/>
-      </w:r>
-    </w:p>
-    <w:p>
-      <w:pPr>
-        <w:ind w:left="1440"/>
-        <w:rPr>
-          <w:rFonts w:ascii="Tahoma" w:hAnsi="Tahoma" w:cs="Tahoma"/>
-          <w:color w:val="000000"/>
-          <w:sz w:val="18"/>
-          <w:szCs w:val="18"/>
-        </w:rPr>
-      </w:pPr>
-      <w:r>
-        <w:rPr>
-          <w:rFonts w:ascii="Tahoma" w:hAnsi="Tahoma" w:cs="Tahoma"/>
-          <w:color w:val="000000"/>
-          <w:sz w:val="18"/>
-          <w:szCs w:val="18"/>
-        </w:rPr>
-        <w:t xml:space="preserve">Alamat Hunian </w:t>
-      </w:r>
-      <w:r>
-        <w:rPr>
-          <w:rFonts w:ascii="Tahoma" w:hAnsi="Tahoma" w:cs="Tahoma"/>
-          <w:color w:val="000000"/>
-          <w:sz w:val="18"/>
-          <w:szCs w:val="18"/>
-        </w:rPr>
-        <w:tab/>
-      </w:r>
-      <w:r>
-        <w:rPr>
-          <w:rFonts w:ascii="Tahoma" w:hAnsi="Tahoma" w:cs="Tahoma"/>
-          <w:color w:val="000000"/>
-          <w:sz w:val="18"/>
-          <w:szCs w:val="18"/>
-        </w:rPr>
-        <w:tab/>
-        <w:t>:</w:t>
-      </w:r>
-      <w:r>
-        <w:rPr>
-          <w:rFonts w:ascii="Tahoma" w:hAnsi="Tahoma" w:cs="Tahoma"/>
-          <w:color w:val="000000"/>
-          <w:sz w:val="18"/>
-          <w:szCs w:val="18"/>
-        </w:rPr>
-        <w:t xml:space="preserve"> </w:t>
-      </w:r>
-      <w:r>
-        <w:rPr>
-          <w:rFonts w:ascii="Tahoma" w:hAnsi="Tahoma" w:cs="Tahoma"/>
-          <w:color w:val="000000"/>
-          <w:sz w:val="18"/>
-          <w:szCs w:val="18"/>
-        </w:rPr>
-        <w:fldChar w:fldCharType="begin"/>
-      </w:r>
-      <w:r>
-        <w:rPr>
-          <w:rFonts w:ascii="Tahoma" w:hAnsi="Tahoma" w:cs="Tahoma"/>
-          <w:color w:val="000000"/>
-          <w:sz w:val="18"/>
-          <w:szCs w:val="18"/>
-        </w:rPr>
-        <w:instrText xml:space="preserve"> MERGEFIELD NOMOR__HUNIAN </w:instrText>
-      </w:r>
-      <w:r>
-        <w:rPr>
-          <w:rFonts w:ascii="Tahoma" w:hAnsi="Tahoma" w:cs="Tahoma"/>
-          <w:color w:val="000000"/>
-          <w:sz w:val="18"/>
-          <w:szCs w:val="18"/>
-        </w:rPr>
-        <w:fldChar w:fldCharType="separate"/>
-      </w:r>
-      <w:r>
-        <w:rPr>
-          <w:rFonts w:ascii="Tahoma" w:hAnsi="Tahoma" w:cs="Tahoma"/>
-          <w:noProof/>
-          <w:color w:val="000000"/>
-          <w:sz w:val="18"/>
-          <w:szCs w:val="18"/>
-        </w:rPr>
-        <w:t>D</w:t>
-      </w:r>
-      <w:r>
-        <w:rPr>
-          <w:rFonts w:ascii="Tahoma" w:hAnsi="Tahoma" w:cs="Tahoma"/>
-          <w:color w:val="000000"/>
-          <w:sz w:val="18"/>
-          <w:szCs w:val="18"/>
-        </w:rPr>
-        <w:fldChar w:fldCharType="end"/>
-      </w:r>
-      <w:r>
-        <w:rPr>
-          <w:rFonts w:ascii="Tahoma" w:hAnsi="Tahoma" w:cs="Tahoma"/>
-          <w:color w:val="000000"/>
-          <w:sz w:val="18"/>
-          <w:szCs w:val="18"/>
-        </w:rPr>
-        <w:t xml:space="preserve"> </w:t>
-      </w:r>
-      <w:r>
-        <w:rPr>
-          <w:rFonts w:ascii="Tahoma" w:hAnsi="Tahoma" w:cs="Tahoma"/>
-          <w:color w:val="000000"/>
-          <w:sz w:val="18"/>
-          <w:szCs w:val="18"/>
-        </w:rPr>
-        <w:fldChar w:fldCharType="begin"/>
-      </w:r>
-      <w:r>
-        <w:rPr>
-          <w:rFonts w:ascii="Tahoma" w:hAnsi="Tahoma" w:cs="Tahoma"/>
-          <w:color w:val="000000"/>
-          <w:sz w:val="18"/>
-          <w:szCs w:val="18"/>
-        </w:rPr>
-        <w:instrText xml:space="preserve"> MERGEFIELD F3 </w:instrText>
-      </w:r>
-      <w:r>
-        <w:rPr>
-          <w:rFonts w:ascii="Tahoma" w:hAnsi="Tahoma" w:cs="Tahoma"/>
-          <w:color w:val="000000"/>
-          <w:sz w:val="18"/>
-          <w:szCs w:val="18"/>
-        </w:rPr>
-        <w:fldChar w:fldCharType="separate"/>
-      </w:r>
-      <w:r>
-        <w:rPr>
-          <w:rFonts w:ascii="Tahoma" w:hAnsi="Tahoma" w:cs="Tahoma"/>
-          <w:noProof/>
-          <w:color w:val="000000"/>
-          <w:sz w:val="18"/>
-          <w:szCs w:val="18"/>
-        </w:rPr>
-        <w:t>IV</w:t>
-      </w:r>
-      <w:r>
-        <w:rPr>
-          <w:rFonts w:ascii="Tahoma" w:hAnsi="Tahoma" w:cs="Tahoma"/>
-          <w:color w:val="000000"/>
-          <w:sz w:val="18"/>
-          <w:szCs w:val="18"/>
-        </w:rPr>
-        <w:fldChar w:fldCharType="end"/>
-      </w:r>
-      <w:r>
-        <w:rPr>
-          <w:rFonts w:ascii="Tahoma" w:hAnsi="Tahoma" w:cs="Tahoma"/>
-          <w:color w:val="000000"/>
-          <w:sz w:val="18"/>
-          <w:szCs w:val="18"/>
-        </w:rPr>
-        <w:t xml:space="preserve"> </w:t>
-      </w:r>
-      <w:r>
-        <w:rPr>
-          <w:rFonts w:ascii="Tahoma" w:hAnsi="Tahoma" w:cs="Tahoma"/>
-          <w:color w:val="000000"/>
-          <w:sz w:val="18"/>
-          <w:szCs w:val="18"/>
-        </w:rPr>
-        <w:fldChar w:fldCharType="begin"/>
-      </w:r>
-      <w:r>
-        <w:rPr>
-          <w:rFonts w:ascii="Tahoma" w:hAnsi="Tahoma" w:cs="Tahoma"/>
-          <w:color w:val="000000"/>
-          <w:sz w:val="18"/>
-          <w:szCs w:val="18"/>
-        </w:rPr>
-        <w:instrText xml:space="preserve"> MERGEFIELD F4 </w:instrText>
-      </w:r>
-      <w:r>
-        <w:rPr>
-          <w:rFonts w:ascii="Tahoma" w:hAnsi="Tahoma" w:cs="Tahoma"/>
-          <w:color w:val="000000"/>
-          <w:sz w:val="18"/>
-          <w:szCs w:val="18"/>
-        </w:rPr>
-        <w:fldChar w:fldCharType="separate"/>
-      </w:r>
-      <w:r>
-        <w:rPr>
-          <w:rFonts w:ascii="Tahoma" w:hAnsi="Tahoma" w:cs="Tahoma"/>
-          <w:noProof/>
-          <w:color w:val="000000"/>
-          <w:sz w:val="18"/>
-          <w:szCs w:val="18"/>
-        </w:rPr>
-        <w:t>19</w:t>
-      </w:r>
-      <w:r>
-        <w:rPr>
-          <w:rFonts w:ascii="Tahoma" w:hAnsi="Tahoma" w:cs="Tahoma"/>
-          <w:color w:val="000000"/>
-          <w:sz w:val="18"/>
-          <w:szCs w:val="18"/>
-        </w:rPr>
-        <w:fldChar w:fldCharType="end"/>
-      </w:r>
-    </w:p>
-    <w:p>
-      <w:pPr>
-        <w:ind w:left="1440"/>
-        <w:rPr>
-          <w:rFonts w:ascii="Tahoma" w:hAnsi="Tahoma" w:cs="Tahoma"/>
-          <w:color w:val="000000"/>
-          <w:sz w:val="18"/>
-          <w:szCs w:val="18"/>
-        </w:rPr>
-      </w:pPr>
-      <w:r>
-        <w:rPr>
-          <w:rFonts w:ascii="Tahoma" w:hAnsi="Tahoma" w:cs="Tahoma"/>
-          <w:color w:val="000000"/>
-          <w:sz w:val="18"/>
-          <w:szCs w:val="18"/>
-        </w:rPr>
-        <w:t xml:space="preserve">Unit Rusunawa </w:t>
-      </w:r>
-      <w:r>
-        <w:rPr>
-          <w:rFonts w:ascii="Tahoma" w:hAnsi="Tahoma" w:cs="Tahoma"/>
-          <w:color w:val="000000"/>
-          <w:sz w:val="18"/>
-          <w:szCs w:val="18"/>
-        </w:rPr>
-        <w:tab/>
-      </w:r>
-      <w:r>
-        <w:rPr>
-          <w:rFonts w:ascii="Tahoma" w:hAnsi="Tahoma" w:cs="Tahoma"/>
-          <w:color w:val="000000"/>
-          <w:sz w:val="18"/>
-          <w:szCs w:val="18"/>
-        </w:rPr>
-        <w:tab/>
-        <w:t>:</w:t>
-      </w:r>
-      <w:r>
-        <w:rPr>
-          <w:rFonts w:ascii="Tahoma" w:hAnsi="Tahoma" w:cs="Tahoma"/>
-          <w:color w:val="000000"/>
-          <w:sz w:val="18"/>
-          <w:szCs w:val="18"/>
-        </w:rPr>
-        <w:t xml:space="preserve"> </w:t>
-      </w:r>
-      <w:r>
-        <w:rPr>
-          <w:rFonts w:ascii="Tahoma" w:hAnsi="Tahoma" w:cs="Tahoma"/>
-          <w:color w:val="000000"/>
-          <w:sz w:val="18"/>
-          <w:szCs w:val="18"/>
-        </w:rPr>
-        <w:t>Rusunawa</w:t>
-      </w:r>
-      <w:r>
-        <w:rPr>
-          <w:rFonts w:ascii="Tahoma" w:hAnsi="Tahoma" w:cs="Tahoma"/>
-          <w:color w:val="000000"/>
-          <w:sz w:val="18"/>
-          <w:szCs w:val="18"/>
-        </w:rPr>
-        <w:t xml:space="preserve"> Cibeureum</w:t>
-      </w:r>
-    </w:p>
-    <w:p>
-      <w:pPr>
-        <w:ind w:left="1440"/>
-        <w:rPr>
-          <w:rFonts w:ascii="Tahoma" w:hAnsi="Tahoma" w:cs="Tahoma"/>
-          <w:color w:val="000000"/>
-          <w:sz w:val="18"/>
-          <w:szCs w:val="18"/>
-        </w:rPr>
-      </w:pPr>
-      <w:r>
-        <w:rPr>
-          <w:rFonts w:ascii="Tahoma" w:hAnsi="Tahoma" w:cs="Tahoma"/>
-          <w:color w:val="000000"/>
-          <w:sz w:val="18"/>
-          <w:szCs w:val="18"/>
-        </w:rPr>
-        <w:t xml:space="preserve">No Rekening / An </w:t>
-      </w:r>
-      <w:r>
-        <w:rPr>
-          <w:rFonts w:ascii="Tahoma" w:hAnsi="Tahoma" w:cs="Tahoma"/>
-          <w:color w:val="000000"/>
-          <w:sz w:val="18"/>
-          <w:szCs w:val="18"/>
-        </w:rPr>
-        <w:tab/>
-      </w:r>
-      <w:r>
-        <w:rPr>
-          <w:rFonts w:ascii="Tahoma" w:hAnsi="Tahoma" w:cs="Tahoma"/>
-          <w:color w:val="000000"/>
-          <w:sz w:val="18"/>
-          <w:szCs w:val="18"/>
-        </w:rPr>
-        <w:tab/>
-        <w:t xml:space="preserve">: </w:t>
-      </w:r>
-      <w:r>
-        <w:rPr>
-          <w:rFonts w:ascii="Tahoma" w:hAnsi="Tahoma" w:cs="Tahoma"/>
-          <w:b/>
-          <w:color w:val="000000"/>
-          <w:sz w:val="18"/>
-          <w:szCs w:val="18"/>
-        </w:rPr>
-        <w:t>0083 0732 92001</w:t>
-      </w:r>
-      <w:r>
-        <w:rPr>
-          <w:rFonts w:ascii="Tahoma" w:hAnsi="Tahoma" w:cs="Tahoma"/>
-          <w:color w:val="000000"/>
-          <w:sz w:val="18"/>
-          <w:szCs w:val="18"/>
-        </w:rPr>
-        <w:t xml:space="preserve">/ Bendahara Penerimaan Disperkim Kota Cimahi  </w:t>
-      </w:r>
-    </w:p>
-    <w:p>
-      <w:pPr>
         <w:spacing w:before="60"/>
         <w:ind w:left="992" w:firstLine="720"/>
         <w:rPr>
@@ -945,15 +747,67 @@
           <w:szCs w:val="18"/>
         </w:rPr>
       </w:pPr>
-      <w:r>
-        <w:rPr>
-          <w:rFonts w:ascii="Tahoma" w:hAnsi="Tahoma" w:cs="Tahoma"/>
-          <w:color w:val="000000"/>
-          <w:sz w:val="18"/>
-          <w:szCs w:val="18"/>
-        </w:rPr>
-        <w:t xml:space="preserve">Dengan rincian sebagai </w:t>
-      </w:r>
+      <w:proofErr w:type="spellStart"/>
+      <w:r>
+        <w:rPr>
+          <w:rFonts w:ascii="Tahoma" w:hAnsi="Tahoma" w:cs="Tahoma"/>
+          <w:color w:val="000000"/>
+          <w:sz w:val="18"/>
+          <w:szCs w:val="18"/>
+        </w:rPr>
+        <w:t>Dengan</w:t>
+      </w:r>
+      <w:proofErr w:type="spellEnd"/>
+      <w:r>
+        <w:rPr>
+          <w:rFonts w:ascii="Tahoma" w:hAnsi="Tahoma" w:cs="Tahoma"/>
+          <w:color w:val="000000"/>
+          <w:sz w:val="18"/>
+          <w:szCs w:val="18"/>
+        </w:rPr>
+        <w:t xml:space="preserve"> </w:t>
+      </w:r>
+      <w:proofErr w:type="spellStart"/>
+      <w:r>
+        <w:rPr>
+          <w:rFonts w:ascii="Tahoma" w:hAnsi="Tahoma" w:cs="Tahoma"/>
+          <w:color w:val="000000"/>
+          <w:sz w:val="18"/>
+          <w:szCs w:val="18"/>
+        </w:rPr>
+        <w:t>rincian</w:t>
+      </w:r>
+      <w:proofErr w:type="spellEnd"/>
+      <w:r>
+        <w:rPr>
+          <w:rFonts w:ascii="Tahoma" w:hAnsi="Tahoma" w:cs="Tahoma"/>
+          <w:color w:val="000000"/>
+          <w:sz w:val="18"/>
+          <w:szCs w:val="18"/>
+        </w:rPr>
+        <w:t xml:space="preserve"> </w:t>
+      </w:r>
+      <w:proofErr w:type="spellStart"/>
+      <w:r>
+        <w:rPr>
+          <w:rFonts w:ascii="Tahoma" w:hAnsi="Tahoma" w:cs="Tahoma"/>
+          <w:color w:val="000000"/>
+          <w:sz w:val="18"/>
+          <w:szCs w:val="18"/>
+        </w:rPr>
+        <w:t>sebagai</w:t>
+      </w:r>
+      <w:proofErr w:type="spellEnd"/>
+      <w:r>
+        <w:rPr>
+          <w:rFonts w:ascii="Tahoma" w:hAnsi="Tahoma" w:cs="Tahoma"/>
+          <w:color w:val="000000"/>
+          <w:sz w:val="18"/>
+          <w:szCs w:val="18"/>
+        </w:rPr>
+        <w:t xml:space="preserve"> </w:t>
+      </w:r>
+      <w:proofErr w:type="spellStart"/>
       <w:proofErr w:type="gramStart"/>
       <w:r>
         <w:rPr>
@@ -962,13 +816,23 @@
           <w:sz w:val="18"/>
           <w:szCs w:val="18"/>
         </w:rPr>
-        <w:t>berikut :</w:t>
+        <w:t>berikut</w:t>
+      </w:r>
+      <w:proofErr w:type="spellEnd"/>
+      <w:r>
+        <w:rPr>
+          <w:rFonts w:ascii="Tahoma" w:hAnsi="Tahoma" w:cs="Tahoma"/>
+          <w:color w:val="000000"/>
+          <w:sz w:val="18"/>
+          <w:szCs w:val="18"/>
+        </w:rPr>
+        <w:t xml:space="preserve"> :</w:t>
       </w:r>
       <w:proofErr w:type="gramEnd"/>
     </w:p>
     <w:tbl>
       <w:tblPr>
-        <w:tblW w:w="8647" w:type="dxa"/>
+        <w:tblW w:w="8829" w:type="dxa"/>
         <w:tblInd w:w="1413" w:type="dxa"/>
         <w:tblBorders>
           <w:top w:val="single" w:sz="4" w:space="0" w:color="auto"/>
@@ -983,7 +847,7 @@
       <w:tblGrid>
         <w:gridCol w:w="567"/>
         <w:gridCol w:w="5022"/>
-        <w:gridCol w:w="3058"/>
+        <w:gridCol w:w="3240"/>
       </w:tblGrid>
       <w:tr>
         <w:tc>
@@ -1042,7 +906,7 @@
         </w:tc>
         <w:tc>
           <w:tcPr>
-            <w:tcW w:w="3058" w:type="dxa"/>
+            <w:tcW w:w="3240" w:type="dxa"/>
           </w:tcPr>
           <w:p>
             <w:pPr>
@@ -1109,6 +973,7 @@
                 <w:lang w:val="en-US"/>
               </w:rPr>
             </w:pPr>
+            <w:proofErr w:type="spellStart"/>
             <w:r>
               <w:rPr>
                 <w:rFonts w:ascii="Tahoma" w:hAnsi="Tahoma" w:cs="Tahoma"/>
@@ -1117,8 +982,9 @@
                 <w:sz w:val="20"/>
                 <w:szCs w:val="20"/>
               </w:rPr>
-              <w:t xml:space="preserve">Sewa </w:t>
-            </w:r>
+              <w:t>Sewa</w:t>
+            </w:r>
+            <w:proofErr w:type="spellEnd"/>
             <w:r>
               <w:rPr>
                 <w:rFonts w:ascii="Tahoma" w:hAnsi="Tahoma" w:cs="Tahoma"/>
@@ -1126,6 +992,16 @@
                 <w:color w:val="000000"/>
                 <w:sz w:val="20"/>
                 <w:szCs w:val="20"/>
+              </w:rPr>
+              <w:t xml:space="preserve"> </w:t>
+            </w:r>
+            <w:r>
+              <w:rPr>
+                <w:rFonts w:ascii="Tahoma" w:hAnsi="Tahoma" w:cs="Tahoma"/>
+                <w:iCs/>
+                <w:color w:val="000000"/>
+                <w:sz w:val="20"/>
+                <w:szCs w:val="20"/>
                 <w:lang w:val="id-ID"/>
               </w:rPr>
               <w:t>Hunian</w:t>
@@ -1141,6 +1017,7 @@
               </w:rPr>
               <w:t xml:space="preserve"> </w:t>
             </w:r>
+            <w:proofErr w:type="spellStart"/>
             <w:r>
               <w:rPr>
                 <w:rFonts w:ascii="Tahoma" w:hAnsi="Tahoma" w:cs="Tahoma"/>
@@ -1151,8 +1028,9 @@
                 <w:szCs w:val="20"/>
                 <w:lang w:val="en-US"/>
               </w:rPr>
-              <w:t xml:space="preserve">Bulan </w:t>
-            </w:r>
+              <w:t>Bulan</w:t>
+            </w:r>
+            <w:proofErr w:type="spellEnd"/>
             <w:r>
               <w:rPr>
                 <w:rFonts w:ascii="Tahoma" w:hAnsi="Tahoma" w:cs="Tahoma"/>
@@ -1163,8 +1041,9 @@
                 <w:szCs w:val="20"/>
                 <w:lang w:val="en-US"/>
               </w:rPr>
-              <w:t>Januari</w:t>
-            </w:r>
+              <w:t xml:space="preserve"> </w:t>
+            </w:r>
+            <w:proofErr w:type="gramStart"/>
             <w:r>
               <w:rPr>
                 <w:rFonts w:ascii="Tahoma" w:hAnsi="Tahoma" w:cs="Tahoma"/>
@@ -1175,8 +1054,9 @@
                 <w:szCs w:val="20"/>
                 <w:lang w:val="en-US"/>
               </w:rPr>
-              <w:t xml:space="preserve"> </w:t>
-            </w:r>
+              <w:t xml:space="preserve">{{ </w:t>
+            </w:r>
+            <w:proofErr w:type="spellStart"/>
             <w:r>
               <w:rPr>
                 <w:rFonts w:ascii="Tahoma" w:hAnsi="Tahoma" w:cs="Tahoma"/>
@@ -1187,8 +1067,9 @@
                 <w:szCs w:val="20"/>
                 <w:lang w:val="en-US"/>
               </w:rPr>
-              <w:t>202</w:t>
-            </w:r>
+              <w:t>bulan</w:t>
+            </w:r>
+            <w:proofErr w:type="gramEnd"/>
             <w:r>
               <w:rPr>
                 <w:rFonts w:ascii="Tahoma" w:hAnsi="Tahoma" w:cs="Tahoma"/>
@@ -1199,13 +1080,79 @@
                 <w:szCs w:val="20"/>
                 <w:lang w:val="en-US"/>
               </w:rPr>
-              <w:t>6</w:t>
+              <w:t>_tagihan</w:t>
+            </w:r>
+            <w:proofErr w:type="spellEnd"/>
+            <w:r>
+              <w:rPr>
+                <w:rFonts w:ascii="Tahoma" w:hAnsi="Tahoma" w:cs="Tahoma"/>
+                <w:b/>
+                <w:iCs/>
+                <w:color w:val="000000"/>
+                <w:sz w:val="20"/>
+                <w:szCs w:val="20"/>
+                <w:lang w:val="en-US"/>
+              </w:rPr>
+              <w:t xml:space="preserve"> }}</w:t>
+            </w:r>
+            <w:r>
+              <w:t xml:space="preserve"> </w:t>
+            </w:r>
+            <w:r>
+              <w:rPr>
+                <w:rFonts w:ascii="Tahoma" w:hAnsi="Tahoma" w:cs="Tahoma"/>
+                <w:b/>
+                <w:iCs/>
+                <w:color w:val="000000"/>
+                <w:sz w:val="20"/>
+                <w:szCs w:val="20"/>
+                <w:lang w:val="en-US"/>
+              </w:rPr>
+              <w:t xml:space="preserve">{{ </w:t>
+            </w:r>
+            <w:proofErr w:type="spellStart"/>
+            <w:r>
+              <w:rPr>
+                <w:rFonts w:ascii="Tahoma" w:hAnsi="Tahoma" w:cs="Tahoma"/>
+                <w:b/>
+                <w:iCs/>
+                <w:color w:val="000000"/>
+                <w:sz w:val="20"/>
+                <w:szCs w:val="20"/>
+                <w:lang w:val="en-US"/>
+              </w:rPr>
+              <w:t>tahun_tagihan</w:t>
+            </w:r>
+            <w:proofErr w:type="spellEnd"/>
+            <w:r>
+              <w:rPr>
+                <w:rFonts w:ascii="Tahoma" w:hAnsi="Tahoma" w:cs="Tahoma"/>
+                <w:b/>
+                <w:iCs/>
+                <w:color w:val="000000"/>
+                <w:sz w:val="20"/>
+                <w:szCs w:val="20"/>
+                <w:lang w:val="en-US"/>
+              </w:rPr>
+              <w:t xml:space="preserve"> }}</w:t>
+            </w:r>
+            <w:r>
+              <w:rPr>
+                <w:rFonts w:ascii="Tahoma" w:hAnsi="Tahoma" w:cs="Tahoma"/>
+                <w:b/>
+                <w:iCs/>
+                <w:color w:val="000000"/>
+                <w:sz w:val="20"/>
+                <w:szCs w:val="20"/>
+                <w:lang w:val="en-US"/>
+              </w:rPr>
+              <w:tab/>
             </w:r>
           </w:p>
         </w:tc>
         <w:tc>
           <w:tcPr>
-            <w:tcW w:w="3058" w:type="dxa"/>
+            <w:tcW w:w="3240" w:type="dxa"/>
           </w:tcPr>
           <w:p>
             <w:pPr>
@@ -1237,6 +1184,7 @@
               </w:rPr>
               <w:t xml:space="preserve"> </w:t>
             </w:r>
+            <w:proofErr w:type="gramStart"/>
             <w:r>
               <w:rPr>
                 <w:rFonts w:ascii="Tahoma" w:hAnsi="Tahoma" w:cs="Tahoma"/>
@@ -1245,8 +1193,9 @@
                 <w:sz w:val="20"/>
                 <w:szCs w:val="20"/>
               </w:rPr>
-              <w:fldChar w:fldCharType="begin"/>
-            </w:r>
+              <w:t xml:space="preserve">{{ </w:t>
+            </w:r>
+            <w:proofErr w:type="spellStart"/>
             <w:r>
               <w:rPr>
                 <w:rFonts w:ascii="Tahoma" w:hAnsi="Tahoma" w:cs="Tahoma"/>
@@ -1255,8 +1204,9 @@
                 <w:sz w:val="20"/>
                 <w:szCs w:val="20"/>
               </w:rPr>
-              <w:instrText xml:space="preserve"> MERGEFIELD SEWA__HUNIAN </w:instrText>
-            </w:r>
+              <w:t>sewa</w:t>
+            </w:r>
+            <w:proofErr w:type="gramEnd"/>
             <w:r>
               <w:rPr>
                 <w:rFonts w:ascii="Tahoma" w:hAnsi="Tahoma" w:cs="Tahoma"/>
@@ -1265,8 +1215,9 @@
                 <w:sz w:val="20"/>
                 <w:szCs w:val="20"/>
               </w:rPr>
-              <w:instrText>\# 0</w:instrText>
-            </w:r>
+              <w:t>_price</w:t>
+            </w:r>
+            <w:proofErr w:type="spellEnd"/>
             <w:r>
               <w:rPr>
                 <w:rFonts w:ascii="Tahoma" w:hAnsi="Tahoma" w:cs="Tahoma"/>
@@ -1275,7 +1226,7 @@
                 <w:sz w:val="20"/>
                 <w:szCs w:val="20"/>
               </w:rPr>
-              <w:instrText>,</w:instrText>
+              <w:t xml:space="preserve"> }}</w:t>
             </w:r>
             <w:r>
               <w:rPr>
@@ -1285,38 +1236,7 @@
                 <w:sz w:val="20"/>
                 <w:szCs w:val="20"/>
               </w:rPr>
-              <w:instrText>00</w:instrText>
-            </w:r>
-            <w:r>
-              <w:rPr>
-                <w:rFonts w:ascii="Tahoma" w:hAnsi="Tahoma" w:cs="Tahoma"/>
-                <w:i/>
-                <w:color w:val="000000"/>
-                <w:sz w:val="20"/>
-                <w:szCs w:val="20"/>
-              </w:rPr>
-              <w:fldChar w:fldCharType="separate"/>
-            </w:r>
-            <w:r>
-              <w:rPr>
-                <w:rFonts w:ascii="Tahoma" w:hAnsi="Tahoma" w:cs="Tahoma"/>
-                <w:i/>
-                <w:noProof/>
-                <w:color w:val="000000"/>
-                <w:sz w:val="20"/>
-                <w:szCs w:val="20"/>
-              </w:rPr>
-              <w:t>395,000</w:t>
-            </w:r>
-            <w:r>
-              <w:rPr>
-                <w:rFonts w:ascii="Tahoma" w:hAnsi="Tahoma" w:cs="Tahoma"/>
-                <w:i/>
-                <w:color w:val="000000"/>
-                <w:sz w:val="20"/>
-                <w:szCs w:val="20"/>
-              </w:rPr>
-              <w:fldChar w:fldCharType="end"/>
+              <w:tab/>
             </w:r>
           </w:p>
         </w:tc>
@@ -1378,7 +1298,7 @@
         </w:tc>
         <w:tc>
           <w:tcPr>
-            <w:tcW w:w="3058" w:type="dxa"/>
+            <w:tcW w:w="3240" w:type="dxa"/>
           </w:tcPr>
           <w:p>
             <w:pPr>
@@ -1400,6 +1320,7 @@
               </w:rPr>
               <w:t xml:space="preserve">Rp. </w:t>
             </w:r>
+            <w:proofErr w:type="gramStart"/>
             <w:r>
               <w:rPr>
                 <w:rFonts w:ascii="Tahoma" w:hAnsi="Tahoma" w:cs="Tahoma"/>
@@ -1408,8 +1329,9 @@
                 <w:sz w:val="20"/>
                 <w:szCs w:val="20"/>
               </w:rPr>
-              <w:fldChar w:fldCharType="begin"/>
-            </w:r>
+              <w:t xml:space="preserve">{{ </w:t>
+            </w:r>
+            <w:proofErr w:type="spellStart"/>
             <w:r>
               <w:rPr>
                 <w:rFonts w:ascii="Tahoma" w:hAnsi="Tahoma" w:cs="Tahoma"/>
@@ -1418,8 +1340,9 @@
                 <w:sz w:val="20"/>
                 <w:szCs w:val="20"/>
               </w:rPr>
-              <w:instrText xml:space="preserve"> MERGEFIELD SEWA_LAHAN_LANTAI_I </w:instrText>
-            </w:r>
+              <w:t>parking</w:t>
+            </w:r>
+            <w:proofErr w:type="gramEnd"/>
             <w:r>
               <w:rPr>
                 <w:rFonts w:ascii="Tahoma" w:hAnsi="Tahoma" w:cs="Tahoma"/>
@@ -1428,8 +1351,9 @@
                 <w:sz w:val="20"/>
                 <w:szCs w:val="20"/>
               </w:rPr>
-              <w:instrText>\# 0</w:instrText>
-            </w:r>
+              <w:t>_price</w:t>
+            </w:r>
+            <w:proofErr w:type="spellEnd"/>
             <w:r>
               <w:rPr>
                 <w:rFonts w:ascii="Tahoma" w:hAnsi="Tahoma" w:cs="Tahoma"/>
@@ -1438,7 +1362,7 @@
                 <w:sz w:val="20"/>
                 <w:szCs w:val="20"/>
               </w:rPr>
-              <w:instrText>,</w:instrText>
+              <w:t xml:space="preserve"> }}</w:t>
             </w:r>
             <w:r>
               <w:rPr>
@@ -1448,38 +1372,7 @@
                 <w:sz w:val="20"/>
                 <w:szCs w:val="20"/>
               </w:rPr>
-              <w:instrText>00</w:instrText>
-            </w:r>
-            <w:r>
-              <w:rPr>
-                <w:rFonts w:ascii="Tahoma" w:hAnsi="Tahoma" w:cs="Tahoma"/>
-                <w:i/>
-                <w:color w:val="000000"/>
-                <w:sz w:val="20"/>
-                <w:szCs w:val="20"/>
-              </w:rPr>
-              <w:fldChar w:fldCharType="separate"/>
-            </w:r>
-            <w:r>
-              <w:rPr>
-                <w:rFonts w:ascii="Tahoma" w:hAnsi="Tahoma" w:cs="Tahoma"/>
-                <w:i/>
-                <w:noProof/>
-                <w:color w:val="000000"/>
-                <w:sz w:val="20"/>
-                <w:szCs w:val="20"/>
-              </w:rPr>
-              <w:t>30,000</w:t>
-            </w:r>
-            <w:r>
-              <w:rPr>
-                <w:rFonts w:ascii="Tahoma" w:hAnsi="Tahoma" w:cs="Tahoma"/>
-                <w:i/>
-                <w:color w:val="000000"/>
-                <w:sz w:val="20"/>
-                <w:szCs w:val="20"/>
-              </w:rPr>
-              <w:fldChar w:fldCharType="end"/>
+              <w:tab/>
             </w:r>
           </w:p>
         </w:tc>
@@ -1539,7 +1432,7 @@
         </w:tc>
         <w:tc>
           <w:tcPr>
-            <w:tcW w:w="3058" w:type="dxa"/>
+            <w:tcW w:w="3240" w:type="dxa"/>
           </w:tcPr>
           <w:p>
             <w:pPr>
@@ -1561,6 +1454,7 @@
               </w:rPr>
               <w:t xml:space="preserve">Rp. </w:t>
             </w:r>
+            <w:proofErr w:type="gramStart"/>
             <w:r>
               <w:rPr>
                 <w:rFonts w:ascii="Tahoma" w:hAnsi="Tahoma" w:cs="Tahoma"/>
@@ -1569,8 +1463,9 @@
                 <w:sz w:val="20"/>
                 <w:szCs w:val="20"/>
               </w:rPr>
-              <w:fldChar w:fldCharType="begin"/>
-            </w:r>
+              <w:t xml:space="preserve">{{ </w:t>
+            </w:r>
+            <w:proofErr w:type="spellStart"/>
             <w:r>
               <w:rPr>
                 <w:rFonts w:ascii="Tahoma" w:hAnsi="Tahoma" w:cs="Tahoma"/>
@@ -1579,8 +1474,10 @@
                 <w:sz w:val="20"/>
                 <w:szCs w:val="20"/>
               </w:rPr>
-              <w:instrText xml:space="preserve"> MERGEFIELD DENDA </w:instrText>
-            </w:r>
+              <w:t>denda</w:t>
+            </w:r>
+            <w:proofErr w:type="spellEnd"/>
+            <w:proofErr w:type="gramEnd"/>
             <w:r>
               <w:rPr>
                 <w:rFonts w:ascii="Tahoma" w:hAnsi="Tahoma" w:cs="Tahoma"/>
@@ -1589,7 +1486,7 @@
                 <w:sz w:val="20"/>
                 <w:szCs w:val="20"/>
               </w:rPr>
-              <w:instrText>\# 0</w:instrText>
+              <w:t xml:space="preserve"> }}</w:t>
             </w:r>
             <w:r>
               <w:rPr>
@@ -1599,48 +1496,7 @@
                 <w:sz w:val="20"/>
                 <w:szCs w:val="20"/>
               </w:rPr>
-              <w:instrText>,</w:instrText>
-            </w:r>
-            <w:r>
-              <w:rPr>
-                <w:rFonts w:ascii="Tahoma" w:hAnsi="Tahoma" w:cs="Tahoma"/>
-                <w:i/>
-                <w:color w:val="000000"/>
-                <w:sz w:val="20"/>
-                <w:szCs w:val="20"/>
-              </w:rPr>
-              <w:instrText>00</w:instrText>
-            </w:r>
-            <w:r>
-              <w:rPr>
-                <w:rFonts w:ascii="Tahoma" w:hAnsi="Tahoma" w:cs="Tahoma"/>
-                <w:i/>
-                <w:color w:val="000000"/>
-                <w:sz w:val="20"/>
-                <w:szCs w:val="20"/>
-              </w:rPr>
-              <w:fldChar w:fldCharType="separate"/>
-            </w:r>
-            <w:r>
-              <w:rPr>
-                <w:rFonts w:ascii="Tahoma" w:hAnsi="Tahoma" w:cs="Tahoma"/>
-                <w:i/>
-                <w:noProof/>
-                <w:color w:val="000000"/>
-                <w:sz w:val="20"/>
-                <w:szCs w:val="20"/>
-              </w:rPr>
-              <w:t>8,500</w:t>
-            </w:r>
-            <w:r>
-              <w:rPr>
-                <w:rFonts w:ascii="Tahoma" w:hAnsi="Tahoma" w:cs="Tahoma"/>
-                <w:i/>
-                <w:color w:val="000000"/>
-                <w:sz w:val="20"/>
-                <w:szCs w:val="20"/>
-              </w:rPr>
-              <w:fldChar w:fldCharType="end"/>
+              <w:tab/>
             </w:r>
           </w:p>
         </w:tc>
@@ -1695,7 +1551,7 @@
         </w:tc>
         <w:tc>
           <w:tcPr>
-            <w:tcW w:w="3058" w:type="dxa"/>
+            <w:tcW w:w="3240" w:type="dxa"/>
           </w:tcPr>
           <w:p>
             <w:pPr>
@@ -1719,6 +1575,7 @@
               </w:rPr>
               <w:t xml:space="preserve">Rp. </w:t>
             </w:r>
+            <w:proofErr w:type="gramStart"/>
             <w:r>
               <w:rPr>
                 <w:rFonts w:ascii="Tahoma" w:hAnsi="Tahoma" w:cs="Tahoma"/>
@@ -1728,8 +1585,9 @@
                 <w:sz w:val="20"/>
                 <w:szCs w:val="20"/>
               </w:rPr>
-              <w:fldChar w:fldCharType="begin"/>
-            </w:r>
+              <w:t xml:space="preserve">{{ </w:t>
+            </w:r>
+            <w:proofErr w:type="spellStart"/>
             <w:r>
               <w:rPr>
                 <w:rFonts w:ascii="Tahoma" w:hAnsi="Tahoma" w:cs="Tahoma"/>
@@ -1739,8 +1597,9 @@
                 <w:sz w:val="20"/>
                 <w:szCs w:val="20"/>
               </w:rPr>
-              <w:instrText xml:space="preserve"> MERGEFIELD JUMLAH </w:instrText>
-            </w:r>
+              <w:t>total</w:t>
+            </w:r>
+            <w:proofErr w:type="gramEnd"/>
             <w:r>
               <w:rPr>
                 <w:rFonts w:ascii="Tahoma" w:hAnsi="Tahoma" w:cs="Tahoma"/>
@@ -1750,8 +1609,9 @@
                 <w:sz w:val="20"/>
                 <w:szCs w:val="20"/>
               </w:rPr>
-              <w:instrText>\# 0</w:instrText>
-            </w:r>
+              <w:t>_price</w:t>
+            </w:r>
+            <w:proofErr w:type="spellEnd"/>
             <w:r>
               <w:rPr>
                 <w:rFonts w:ascii="Tahoma" w:hAnsi="Tahoma" w:cs="Tahoma"/>
@@ -1761,52 +1621,7 @@
                 <w:sz w:val="20"/>
                 <w:szCs w:val="20"/>
               </w:rPr>
-              <w:instrText>,</w:instrText>
-            </w:r>
-            <w:r>
-              <w:rPr>
-                <w:rFonts w:ascii="Tahoma" w:hAnsi="Tahoma" w:cs="Tahoma"/>
-                <w:b/>
-                <w:i/>
-                <w:color w:val="000000"/>
-                <w:sz w:val="20"/>
-                <w:szCs w:val="20"/>
-              </w:rPr>
-              <w:instrText>00</w:instrText>
-            </w:r>
-            <w:r>
-              <w:rPr>
-                <w:rFonts w:ascii="Tahoma" w:hAnsi="Tahoma" w:cs="Tahoma"/>
-                <w:b/>
-                <w:i/>
-                <w:color w:val="000000"/>
-                <w:sz w:val="20"/>
-                <w:szCs w:val="20"/>
-              </w:rPr>
-              <w:fldChar w:fldCharType="separate"/>
-            </w:r>
-            <w:r>
-              <w:rPr>
-                <w:rFonts w:ascii="Tahoma" w:hAnsi="Tahoma" w:cs="Tahoma"/>
-                <w:b/>
-                <w:i/>
-                <w:noProof/>
-                <w:color w:val="000000"/>
-                <w:sz w:val="20"/>
-                <w:szCs w:val="20"/>
-              </w:rPr>
-              <w:t>433,500</w:t>
-            </w:r>
-            <w:r>
-              <w:rPr>
-                <w:rFonts w:ascii="Tahoma" w:hAnsi="Tahoma" w:cs="Tahoma"/>
-                <w:b/>
-                <w:i/>
-                <w:color w:val="000000"/>
-                <w:sz w:val="20"/>
-                <w:szCs w:val="20"/>
-              </w:rPr>
-              <w:fldChar w:fldCharType="end"/>
+              <w:t xml:space="preserve"> }}</w:t>
             </w:r>
           </w:p>
         </w:tc>
@@ -1836,16 +1651,16 @@
         <mc:AlternateContent>
           <mc:Choice Requires="wps">
             <w:drawing>
-              <wp:anchor distT="0" distB="0" distL="114300" distR="114300" simplePos="0" relativeHeight="251656192" behindDoc="1" locked="0" layoutInCell="1" allowOverlap="1" wp14:anchorId="44FD971B" wp14:editId="62DA548B">
+              <wp:anchor distT="0" distB="0" distL="114300" distR="114300" simplePos="0" relativeHeight="251656192" behindDoc="1" locked="0" layoutInCell="1" allowOverlap="1" wp14:anchorId="44FD971B" wp14:editId="7FCFB81E">
                 <wp:simplePos x="0" y="0"/>
                 <wp:positionH relativeFrom="column">
-                  <wp:posOffset>1146175</wp:posOffset>
+                  <wp:posOffset>1713865</wp:posOffset>
                 </wp:positionH>
                 <wp:positionV relativeFrom="paragraph">
-                  <wp:posOffset>107950</wp:posOffset>
+                  <wp:posOffset>112102</wp:posOffset>
                 </wp:positionV>
-                <wp:extent cx="4853940" cy="259715"/>
-                <wp:effectExtent l="10160" t="5080" r="12700" b="11430"/>
+                <wp:extent cx="4783015" cy="259715"/>
+                <wp:effectExtent l="0" t="0" r="17780" b="26035"/>
                 <wp:wrapNone/>
                 <wp:docPr id="1405392418" name="Rectangle 32"/>
                 <wp:cNvGraphicFramePr>
@@ -1860,7 +1675,7 @@
                       <wps:spPr bwMode="auto">
                         <a:xfrm>
                           <a:off x="0" y="0"/>
-                          <a:ext cx="4853940" cy="259715"/>
+                          <a:ext cx="4783015" cy="259715"/>
                         </a:xfrm>
                         <a:prstGeom prst="rect">
                           <a:avLst/>
@@ -1894,7 +1709,7 @@
           </mc:Choice>
           <mc:Fallback>
             <w:pict>
-              <v:rect w14:anchorId="72F13C87" id="Rectangle 32" o:spid="_x0000_s1026" style="position:absolute;margin-left:90.25pt;margin-top:8.5pt;width:382.2pt;height:20.45pt;z-index:-251660288;visibility:visible;mso-wrap-style:square;mso-width-percent:0;mso-height-percent:0;mso-wrap-distance-left:9pt;mso-wrap-distance-top:0;mso-wrap-distance-right:9pt;mso-wrap-distance-bottom:0;mso-position-horizontal:absolute;mso-position-horizontal-relative:text;mso-position-vertical:absolute;mso-position-vertical-relative:text;mso-width-percent:0;mso-height-percent:0;mso-width-relative:page;mso-height-relative:page;v-text-anchor:top" o:gfxdata="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"/>
+              <v:rect w14:anchorId="638E42E5" id="Rectangle 32" o:spid="_x0000_s1026" style="position:absolute;margin-left:134.95pt;margin-top:8.85pt;width:376.6pt;height:20.45pt;z-index:-251660288;visibility:visible;mso-wrap-style:square;mso-width-percent:0;mso-height-percent:0;mso-wrap-distance-left:9pt;mso-wrap-distance-top:0;mso-wrap-distance-right:9pt;mso-wrap-distance-bottom:0;mso-position-horizontal:absolute;mso-position-horizontal-relative:text;mso-position-vertical:absolute;mso-position-vertical-relative:text;mso-width-percent:0;mso-height-percent:0;mso-width-relative:page;mso-height-relative:page;v-text-anchor:top" o:gfxdata="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"/>
             </w:pict>
           </mc:Fallback>
         </mc:AlternateContent>
@@ -1902,154 +1717,6 @@
     </w:p>
     <w:p>
       <w:pPr>
-        <w:ind w:left="1440" w:firstLine="720"/>
-        <w:outlineLvl w:val="0"/>
-        <w:rPr>
-          <w:rFonts w:ascii="Tahoma" w:hAnsi="Tahoma" w:cs="Tahoma"/>
-          <w:color w:val="000000"/>
-          <w:sz w:val="18"/>
-          <w:szCs w:val="20"/>
-        </w:rPr>
-      </w:pPr>
-      <w:r>
-        <w:rPr>
-          <w:rFonts w:ascii="Tahoma" w:hAnsi="Tahoma" w:cs="Tahoma"/>
-          <w:i/>
-          <w:color w:val="000000"/>
-          <w:sz w:val="18"/>
-          <w:szCs w:val="20"/>
-        </w:rPr>
-        <w:t xml:space="preserve">Dengan </w:t>
-      </w:r>
-      <w:proofErr w:type="gramStart"/>
-      <w:r>
-        <w:rPr>
-          <w:rFonts w:ascii="Tahoma" w:hAnsi="Tahoma" w:cs="Tahoma"/>
-          <w:i/>
-          <w:color w:val="000000"/>
-          <w:sz w:val="18"/>
-          <w:szCs w:val="20"/>
-        </w:rPr>
-        <w:t>huruf</w:t>
-      </w:r>
-      <w:r>
-        <w:rPr>
-          <w:rFonts w:ascii="Tahoma" w:hAnsi="Tahoma" w:cs="Tahoma"/>
-          <w:color w:val="000000"/>
-          <w:sz w:val="18"/>
-          <w:szCs w:val="20"/>
-        </w:rPr>
-        <w:t xml:space="preserve"> :</w:t>
-      </w:r>
-      <w:proofErr w:type="gramEnd"/>
-      <w:r>
-        <w:rPr>
-          <w:rFonts w:ascii="Tahoma" w:hAnsi="Tahoma" w:cs="Tahoma"/>
-          <w:color w:val="000000"/>
-          <w:sz w:val="18"/>
-          <w:szCs w:val="20"/>
-        </w:rPr>
-        <w:t xml:space="preserve"> </w:t>
-      </w:r>
-      <w:r>
-        <w:rPr>
-          <w:rFonts w:ascii="Tahoma" w:hAnsi="Tahoma" w:cs="Tahoma"/>
-          <w:color w:val="000000"/>
-          <w:sz w:val="18"/>
-          <w:szCs w:val="20"/>
-        </w:rPr>
-        <w:t xml:space="preserve">  # </w:t>
-      </w:r>
-      <w:r>
-        <w:rPr>
-          <w:rFonts w:ascii="Tahoma" w:hAnsi="Tahoma" w:cs="Tahoma"/>
-          <w:b/>
-          <w:i/>
-          <w:color w:val="000000"/>
-          <w:sz w:val="16"/>
-          <w:szCs w:val="18"/>
-        </w:rPr>
-        <w:fldChar w:fldCharType="begin"/>
-      </w:r>
-      <w:r>
-        <w:rPr>
-          <w:rFonts w:ascii="Tahoma" w:hAnsi="Tahoma" w:cs="Tahoma"/>
-          <w:b/>
-          <w:i/>
-          <w:color w:val="000000"/>
-          <w:sz w:val="16"/>
-          <w:szCs w:val="18"/>
-        </w:rPr>
-        <w:instrText xml:space="preserve"> MERGEFIELD TERBILANG </w:instrText>
-      </w:r>
-      <w:r>
-        <w:rPr>
-          <w:rFonts w:ascii="Tahoma" w:hAnsi="Tahoma" w:cs="Tahoma"/>
-          <w:b/>
-          <w:i/>
-          <w:color w:val="000000"/>
-          <w:sz w:val="16"/>
-          <w:szCs w:val="18"/>
-        </w:rPr>
-        <w:fldChar w:fldCharType="separate"/>
-      </w:r>
-      <w:r>
-        <w:rPr>
-          <w:rFonts w:ascii="Tahoma" w:hAnsi="Tahoma" w:cs="Tahoma"/>
-          <w:b/>
-          <w:i/>
-          <w:noProof/>
-          <w:color w:val="000000"/>
-          <w:sz w:val="16"/>
-          <w:szCs w:val="18"/>
-        </w:rPr>
-        <w:t>Empat Ratus Tiga Puluh Tiga Ribu Lima Ratus</w:t>
-      </w:r>
-      <w:r>
-        <w:rPr>
-          <w:rFonts w:ascii="Tahoma" w:hAnsi="Tahoma" w:cs="Tahoma"/>
-          <w:b/>
-          <w:i/>
-          <w:color w:val="000000"/>
-          <w:sz w:val="16"/>
-          <w:szCs w:val="18"/>
-        </w:rPr>
-        <w:fldChar w:fldCharType="end"/>
-      </w:r>
-      <w:r>
-        <w:rPr>
-          <w:rFonts w:ascii="Tahoma" w:hAnsi="Tahoma" w:cs="Tahoma"/>
-          <w:b/>
-          <w:i/>
-          <w:color w:val="000000"/>
-          <w:sz w:val="18"/>
-          <w:szCs w:val="20"/>
-        </w:rPr>
-        <w:t xml:space="preserve"> </w:t>
-      </w:r>
-      <w:r>
-        <w:rPr>
-          <w:rFonts w:ascii="Tahoma" w:hAnsi="Tahoma" w:cs="Tahoma"/>
-          <w:b/>
-          <w:i/>
-          <w:color w:val="000000"/>
-          <w:sz w:val="18"/>
-          <w:szCs w:val="20"/>
-        </w:rPr>
-        <w:t>Rupiah</w:t>
-      </w:r>
-      <w:r>
-        <w:rPr>
-          <w:rFonts w:ascii="Tahoma" w:hAnsi="Tahoma" w:cs="Tahoma"/>
-          <w:color w:val="000000"/>
-          <w:sz w:val="18"/>
-          <w:szCs w:val="20"/>
-        </w:rPr>
-        <w:t>#</w:t>
-      </w:r>
-    </w:p>
-    <w:p>
-      <w:pPr>
         <w:ind w:left="720" w:firstLine="720"/>
         <w:outlineLvl w:val="0"/>
         <w:rPr>
@@ -2059,10 +1726,102 @@
           <w:szCs w:val="20"/>
         </w:rPr>
       </w:pPr>
+      <w:proofErr w:type="spellStart"/>
+      <w:r>
+        <w:rPr>
+          <w:rFonts w:ascii="Tahoma" w:hAnsi="Tahoma" w:cs="Tahoma"/>
+          <w:i/>
+          <w:color w:val="000000"/>
+          <w:sz w:val="18"/>
+          <w:szCs w:val="20"/>
+        </w:rPr>
+        <w:t>Dengan</w:t>
+      </w:r>
+      <w:proofErr w:type="spellEnd"/>
+      <w:r>
+        <w:rPr>
+          <w:rFonts w:ascii="Tahoma" w:hAnsi="Tahoma" w:cs="Tahoma"/>
+          <w:i/>
+          <w:color w:val="000000"/>
+          <w:sz w:val="18"/>
+          <w:szCs w:val="20"/>
+        </w:rPr>
+        <w:t xml:space="preserve"> </w:t>
+      </w:r>
+      <w:proofErr w:type="spellStart"/>
+      <w:proofErr w:type="gramStart"/>
+      <w:r>
+        <w:rPr>
+          <w:rFonts w:ascii="Tahoma" w:hAnsi="Tahoma" w:cs="Tahoma"/>
+          <w:i/>
+          <w:color w:val="000000"/>
+          <w:sz w:val="18"/>
+          <w:szCs w:val="20"/>
+        </w:rPr>
+        <w:t>huruf</w:t>
+      </w:r>
+      <w:proofErr w:type="spellEnd"/>
+      <w:r>
+        <w:rPr>
+          <w:rFonts w:ascii="Tahoma" w:hAnsi="Tahoma" w:cs="Tahoma"/>
+          <w:color w:val="000000"/>
+          <w:sz w:val="18"/>
+          <w:szCs w:val="20"/>
+        </w:rPr>
+        <w:t xml:space="preserve"> :</w:t>
+      </w:r>
+      <w:proofErr w:type="gramEnd"/>
+      <w:r>
+        <w:rPr>
+          <w:rFonts w:ascii="Tahoma" w:hAnsi="Tahoma" w:cs="Tahoma"/>
+          <w:color w:val="000000"/>
+          <w:sz w:val="18"/>
+          <w:szCs w:val="20"/>
+        </w:rPr>
+        <w:t xml:space="preserve"> </w:t>
+      </w:r>
+      <w:r>
+        <w:rPr>
+          <w:rFonts w:ascii="Tahoma" w:hAnsi="Tahoma" w:cs="Tahoma"/>
+          <w:color w:val="000000"/>
+          <w:sz w:val="18"/>
+          <w:szCs w:val="20"/>
+        </w:rPr>
+        <w:t xml:space="preserve">  </w:t>
+      </w:r>
+      <w:r>
+        <w:rPr>
+          <w:rFonts w:ascii="Tahoma" w:hAnsi="Tahoma" w:cs="Tahoma"/>
+          <w:color w:val="000000"/>
+          <w:sz w:val="18"/>
+          <w:szCs w:val="20"/>
+        </w:rPr>
+        <w:t xml:space="preserve">{{ </w:t>
+      </w:r>
+      <w:proofErr w:type="spellStart"/>
+      <w:r>
+        <w:rPr>
+          <w:rFonts w:ascii="Tahoma" w:hAnsi="Tahoma" w:cs="Tahoma"/>
+          <w:color w:val="000000"/>
+          <w:sz w:val="18"/>
+          <w:szCs w:val="20"/>
+        </w:rPr>
+        <w:t>total_price_words</w:t>
+      </w:r>
+      <w:proofErr w:type="spellEnd"/>
+      <w:r>
+        <w:rPr>
+          <w:rFonts w:ascii="Tahoma" w:hAnsi="Tahoma" w:cs="Tahoma"/>
+          <w:color w:val="000000"/>
+          <w:sz w:val="18"/>
+          <w:szCs w:val="20"/>
+        </w:rPr>
+        <w:t xml:space="preserve"> }}</w:t>
+      </w:r>
     </w:p>
     <w:tbl>
       <w:tblPr>
-        <w:tblpPr w:leftFromText="180" w:rightFromText="180" w:vertAnchor="text" w:horzAnchor="margin" w:tblpXSpec="center" w:tblpY="100"/>
+        <w:tblpPr w:leftFromText="180" w:rightFromText="180" w:vertAnchor="page" w:horzAnchor="margin" w:tblpXSpec="center" w:tblpY="5719"/>
         <w:tblW w:w="9951" w:type="dxa"/>
         <w:tblLook w:val="04A0" w:firstRow="1" w:lastRow="0" w:firstColumn="1" w:lastColumn="0" w:noHBand="0" w:noVBand="1"/>
       </w:tblPr>
@@ -2092,6 +1851,7 @@
                 <w:szCs w:val="16"/>
               </w:rPr>
             </w:pPr>
+            <w:proofErr w:type="spellStart"/>
             <w:proofErr w:type="gramStart"/>
             <w:r>
               <w:rPr>
@@ -2101,7 +1861,18 @@
                 <w:sz w:val="18"/>
                 <w:szCs w:val="16"/>
               </w:rPr>
-              <w:t>Catatan :</w:t>
+              <w:t>Catatan</w:t>
+            </w:r>
+            <w:proofErr w:type="spellEnd"/>
+            <w:r>
+              <w:rPr>
+                <w:rFonts w:ascii="Tahoma" w:hAnsi="Tahoma" w:cs="Tahoma"/>
+                <w:b/>
+                <w:color w:val="000000"/>
+                <w:sz w:val="18"/>
+                <w:szCs w:val="16"/>
+              </w:rPr>
+              <w:t xml:space="preserve"> :</w:t>
             </w:r>
             <w:proofErr w:type="gramEnd"/>
           </w:p>
@@ -2274,6 +2045,7 @@
                 <w:lang w:val="id-ID"/>
               </w:rPr>
             </w:pPr>
+            <w:proofErr w:type="spellStart"/>
             <w:r>
               <w:rPr>
                 <w:rFonts w:ascii="Tahoma" w:hAnsi="Tahoma" w:cs="Tahoma"/>
@@ -2283,9 +2055,9 @@
                 <w:szCs w:val="16"/>
                 <w:lang w:val="en-US"/>
               </w:rPr>
-              <w:t xml:space="preserve">Dengan ditertibkannya STRD ini, maka SKRD Bulan </w:t>
-            </w:r>
-            <w:proofErr w:type="gramStart"/>
+              <w:t>Dengan</w:t>
+            </w:r>
+            <w:proofErr w:type="spellEnd"/>
             <w:r>
               <w:rPr>
                 <w:rFonts w:ascii="Tahoma" w:hAnsi="Tahoma" w:cs="Tahoma"/>
@@ -2295,8 +2067,9 @@
                 <w:szCs w:val="16"/>
                 <w:lang w:val="en-US"/>
               </w:rPr>
-              <w:t xml:space="preserve">Januari  </w:t>
-            </w:r>
+              <w:t xml:space="preserve"> </w:t>
+            </w:r>
+            <w:proofErr w:type="spellStart"/>
             <w:r>
               <w:rPr>
                 <w:rFonts w:ascii="Tahoma" w:hAnsi="Tahoma" w:cs="Tahoma"/>
@@ -2306,8 +2079,9 @@
                 <w:szCs w:val="16"/>
                 <w:lang w:val="en-US"/>
               </w:rPr>
-              <w:t>202</w:t>
-            </w:r>
+              <w:t>ditertibkannya</w:t>
+            </w:r>
+            <w:proofErr w:type="spellEnd"/>
             <w:r>
               <w:rPr>
                 <w:rFonts w:ascii="Tahoma" w:hAnsi="Tahoma" w:cs="Tahoma"/>
@@ -2317,9 +2091,9 @@
                 <w:szCs w:val="16"/>
                 <w:lang w:val="en-US"/>
               </w:rPr>
-              <w:t>6</w:t>
-            </w:r>
-            <w:proofErr w:type="gramEnd"/>
+              <w:t xml:space="preserve"> STRD </w:t>
+            </w:r>
+            <w:proofErr w:type="spellStart"/>
             <w:r>
               <w:rPr>
                 <w:rFonts w:ascii="Tahoma" w:hAnsi="Tahoma" w:cs="Tahoma"/>
@@ -2329,7 +2103,228 @@
                 <w:szCs w:val="16"/>
                 <w:lang w:val="en-US"/>
               </w:rPr>
-              <w:t xml:space="preserve"> dinyatakan tidak berlaku.</w:t>
+              <w:t>ini</w:t>
+            </w:r>
+            <w:proofErr w:type="spellEnd"/>
+            <w:r>
+              <w:rPr>
+                <w:rFonts w:ascii="Tahoma" w:hAnsi="Tahoma" w:cs="Tahoma"/>
+                <w:b/>
+                <w:color w:val="00B050"/>
+                <w:sz w:val="16"/>
+                <w:szCs w:val="16"/>
+                <w:lang w:val="en-US"/>
+              </w:rPr>
+              <w:t xml:space="preserve">, </w:t>
+            </w:r>
+            <w:proofErr w:type="spellStart"/>
+            <w:r>
+              <w:rPr>
+                <w:rFonts w:ascii="Tahoma" w:hAnsi="Tahoma" w:cs="Tahoma"/>
+                <w:b/>
+                <w:color w:val="00B050"/>
+                <w:sz w:val="16"/>
+                <w:szCs w:val="16"/>
+                <w:lang w:val="en-US"/>
+              </w:rPr>
+              <w:t>maka</w:t>
+            </w:r>
+            <w:proofErr w:type="spellEnd"/>
+            <w:r>
+              <w:rPr>
+                <w:rFonts w:ascii="Tahoma" w:hAnsi="Tahoma" w:cs="Tahoma"/>
+                <w:b/>
+                <w:color w:val="00B050"/>
+                <w:sz w:val="16"/>
+                <w:szCs w:val="16"/>
+                <w:lang w:val="en-US"/>
+              </w:rPr>
+              <w:t xml:space="preserve"> SKRD </w:t>
+            </w:r>
+            <w:proofErr w:type="spellStart"/>
+            <w:proofErr w:type="gramStart"/>
+            <w:r>
+              <w:rPr>
+                <w:rFonts w:ascii="Tahoma" w:hAnsi="Tahoma" w:cs="Tahoma"/>
+                <w:b/>
+                <w:color w:val="00B050"/>
+                <w:sz w:val="16"/>
+                <w:szCs w:val="16"/>
+                <w:lang w:val="en-US"/>
+              </w:rPr>
+              <w:t>Bulan</w:t>
+            </w:r>
+            <w:proofErr w:type="spellEnd"/>
+            <w:r>
+              <w:rPr>
+                <w:rFonts w:ascii="Tahoma" w:hAnsi="Tahoma" w:cs="Tahoma"/>
+                <w:b/>
+                <w:color w:val="00B050"/>
+                <w:sz w:val="16"/>
+                <w:szCs w:val="16"/>
+                <w:lang w:val="en-US"/>
+              </w:rPr>
+              <w:t xml:space="preserve"> </w:t>
+            </w:r>
+            <w:r>
+              <w:t xml:space="preserve"> </w:t>
+            </w:r>
+            <w:r>
+              <w:rPr>
+                <w:rFonts w:ascii="Tahoma" w:hAnsi="Tahoma" w:cs="Tahoma"/>
+                <w:b/>
+                <w:color w:val="00B050"/>
+                <w:sz w:val="16"/>
+                <w:szCs w:val="16"/>
+                <w:lang w:val="en-US"/>
+              </w:rPr>
+              <w:t>{</w:t>
+            </w:r>
+            <w:proofErr w:type="gramEnd"/>
+            <w:r>
+              <w:rPr>
+                <w:rFonts w:ascii="Tahoma" w:hAnsi="Tahoma" w:cs="Tahoma"/>
+                <w:b/>
+                <w:color w:val="00B050"/>
+                <w:sz w:val="16"/>
+                <w:szCs w:val="16"/>
+                <w:lang w:val="en-US"/>
+              </w:rPr>
+              <w:t xml:space="preserve">{ </w:t>
+            </w:r>
+            <w:proofErr w:type="spellStart"/>
+            <w:r>
+              <w:rPr>
+                <w:rFonts w:ascii="Tahoma" w:hAnsi="Tahoma" w:cs="Tahoma"/>
+                <w:b/>
+                <w:color w:val="00B050"/>
+                <w:sz w:val="16"/>
+                <w:szCs w:val="16"/>
+                <w:lang w:val="en-US"/>
+              </w:rPr>
+              <w:t>bulan_tagihan</w:t>
+            </w:r>
+            <w:proofErr w:type="spellEnd"/>
+            <w:r>
+              <w:rPr>
+                <w:rFonts w:ascii="Tahoma" w:hAnsi="Tahoma" w:cs="Tahoma"/>
+                <w:b/>
+                <w:color w:val="00B050"/>
+                <w:sz w:val="16"/>
+                <w:szCs w:val="16"/>
+                <w:lang w:val="en-US"/>
+              </w:rPr>
+              <w:t xml:space="preserve"> }}</w:t>
+            </w:r>
+            <w:r>
+              <w:t xml:space="preserve"> </w:t>
+            </w:r>
+            <w:r>
+              <w:rPr>
+                <w:rFonts w:ascii="Tahoma" w:hAnsi="Tahoma" w:cs="Tahoma"/>
+                <w:b/>
+                <w:color w:val="00B050"/>
+                <w:sz w:val="16"/>
+                <w:szCs w:val="16"/>
+                <w:lang w:val="en-US"/>
+              </w:rPr>
+              <w:t xml:space="preserve">{{ </w:t>
+            </w:r>
+            <w:proofErr w:type="spellStart"/>
+            <w:r>
+              <w:rPr>
+                <w:rFonts w:ascii="Tahoma" w:hAnsi="Tahoma" w:cs="Tahoma"/>
+                <w:b/>
+                <w:color w:val="00B050"/>
+                <w:sz w:val="16"/>
+                <w:szCs w:val="16"/>
+                <w:lang w:val="en-US"/>
+              </w:rPr>
+              <w:t>tahun_tagihan</w:t>
+            </w:r>
+            <w:proofErr w:type="spellEnd"/>
+            <w:r>
+              <w:rPr>
+                <w:rFonts w:ascii="Tahoma" w:hAnsi="Tahoma" w:cs="Tahoma"/>
+                <w:b/>
+                <w:color w:val="00B050"/>
+                <w:sz w:val="16"/>
+                <w:szCs w:val="16"/>
+                <w:lang w:val="en-US"/>
+              </w:rPr>
+              <w:t xml:space="preserve"> }} </w:t>
+            </w:r>
+            <w:proofErr w:type="spellStart"/>
+            <w:r>
+              <w:rPr>
+                <w:rFonts w:ascii="Tahoma" w:hAnsi="Tahoma" w:cs="Tahoma"/>
+                <w:b/>
+                <w:color w:val="00B050"/>
+                <w:sz w:val="16"/>
+                <w:szCs w:val="16"/>
+                <w:lang w:val="en-US"/>
+              </w:rPr>
+              <w:t>dinyatakan</w:t>
+            </w:r>
+            <w:proofErr w:type="spellEnd"/>
+            <w:r>
+              <w:rPr>
+                <w:rFonts w:ascii="Tahoma" w:hAnsi="Tahoma" w:cs="Tahoma"/>
+                <w:b/>
+                <w:color w:val="00B050"/>
+                <w:sz w:val="16"/>
+                <w:szCs w:val="16"/>
+                <w:lang w:val="en-US"/>
+              </w:rPr>
+              <w:t xml:space="preserve"> </w:t>
+            </w:r>
+            <w:proofErr w:type="spellStart"/>
+            <w:r>
+              <w:rPr>
+                <w:rFonts w:ascii="Tahoma" w:hAnsi="Tahoma" w:cs="Tahoma"/>
+                <w:b/>
+                <w:color w:val="00B050"/>
+                <w:sz w:val="16"/>
+                <w:szCs w:val="16"/>
+                <w:lang w:val="en-US"/>
+              </w:rPr>
+              <w:t>tidak</w:t>
+            </w:r>
+            <w:proofErr w:type="spellEnd"/>
+            <w:r>
+              <w:rPr>
+                <w:rFonts w:ascii="Tahoma" w:hAnsi="Tahoma" w:cs="Tahoma"/>
+                <w:b/>
+                <w:color w:val="00B050"/>
+                <w:sz w:val="16"/>
+                <w:szCs w:val="16"/>
+                <w:lang w:val="en-US"/>
+              </w:rPr>
+              <w:t xml:space="preserve"> </w:t>
+            </w:r>
+            <w:proofErr w:type="spellStart"/>
+            <w:r>
+              <w:rPr>
+                <w:rFonts w:ascii="Tahoma" w:hAnsi="Tahoma" w:cs="Tahoma"/>
+                <w:b/>
+                <w:color w:val="00B050"/>
+                <w:sz w:val="16"/>
+                <w:szCs w:val="16"/>
+                <w:lang w:val="en-US"/>
+              </w:rPr>
+              <w:t>berlaku</w:t>
+            </w:r>
+            <w:proofErr w:type="spellEnd"/>
+            <w:r>
+              <w:rPr>
+                <w:rFonts w:ascii="Tahoma" w:hAnsi="Tahoma" w:cs="Tahoma"/>
+                <w:b/>
+                <w:color w:val="00B050"/>
+                <w:sz w:val="16"/>
+                <w:szCs w:val="16"/>
+                <w:lang w:val="en-US"/>
+              </w:rPr>
+              <w:t>.</w:t>
             </w:r>
           </w:p>
         </w:tc>
@@ -2359,13 +2354,13 @@
               <mc:AlternateContent>
                 <mc:Choice Requires="wps">
                   <w:drawing>
-                    <wp:anchor distT="0" distB="0" distL="114300" distR="114300" simplePos="0" relativeHeight="251659264" behindDoc="0" locked="0" layoutInCell="1" allowOverlap="1" wp14:anchorId="5960E269" wp14:editId="74DAAB1C">
+                    <wp:anchor distT="0" distB="0" distL="114300" distR="114300" simplePos="0" relativeHeight="251659264" behindDoc="0" locked="0" layoutInCell="1" allowOverlap="1" wp14:anchorId="3A6341FC" wp14:editId="369F4B19">
                       <wp:simplePos x="0" y="0"/>
                       <wp:positionH relativeFrom="column">
                         <wp:posOffset>538480</wp:posOffset>
                       </wp:positionH>
                       <wp:positionV relativeFrom="paragraph">
-                        <wp:posOffset>-74930</wp:posOffset>
+                        <wp:posOffset>8157</wp:posOffset>
                       </wp:positionV>
                       <wp:extent cx="2393315" cy="1544955"/>
                       <wp:effectExtent l="0" t="0" r="0" b="0"/>
@@ -2407,37 +2402,59 @@
                                       <w:sz w:val="20"/>
                                     </w:rPr>
                                   </w:pPr>
+                                  <w:proofErr w:type="spellStart"/>
                                   <w:r>
                                     <w:rPr>
                                       <w:rFonts w:ascii="Tahoma" w:eastAsia="Tahoma" w:hAnsi="Tahoma" w:cs="Tahoma"/>
                                       <w:color w:val="000000"/>
                                       <w:sz w:val="20"/>
                                     </w:rPr>
-                                    <w:t xml:space="preserve">Cimahi, </w:t>
+                                    <w:t>Cimahi</w:t>
                                   </w:r>
+                                  <w:proofErr w:type="spellEnd"/>
                                   <w:r>
                                     <w:rPr>
                                       <w:rFonts w:ascii="Tahoma" w:eastAsia="Tahoma" w:hAnsi="Tahoma" w:cs="Tahoma"/>
                                       <w:color w:val="000000"/>
                                       <w:sz w:val="20"/>
                                     </w:rPr>
-                                    <w:t xml:space="preserve">30 Januari </w:t>
+                                    <w:t xml:space="preserve">, </w:t>
                                   </w:r>
+                                  <w:proofErr w:type="gramStart"/>
                                   <w:r>
                                     <w:rPr>
                                       <w:rFonts w:ascii="Tahoma" w:eastAsia="Tahoma" w:hAnsi="Tahoma" w:cs="Tahoma"/>
                                       <w:color w:val="000000"/>
                                       <w:sz w:val="20"/>
                                     </w:rPr>
-                                    <w:t>202</w:t>
+                                    <w:t xml:space="preserve">{{ </w:t>
                                   </w:r>
+                                  <w:proofErr w:type="spellStart"/>
                                   <w:r>
                                     <w:rPr>
                                       <w:rFonts w:ascii="Tahoma" w:eastAsia="Tahoma" w:hAnsi="Tahoma" w:cs="Tahoma"/>
                                       <w:color w:val="000000"/>
                                       <w:sz w:val="20"/>
                                     </w:rPr>
-                                    <w:t>6</w:t>
+                                    <w:t>tanggal</w:t>
+                                  </w:r>
+                                  <w:proofErr w:type="gramEnd"/>
+                                  <w:r>
+                                    <w:rPr>
+                                      <w:rFonts w:ascii="Tahoma" w:eastAsia="Tahoma" w:hAnsi="Tahoma" w:cs="Tahoma"/>
+                                      <w:color w:val="000000"/>
+                                      <w:sz w:val="20"/>
+                                    </w:rPr>
+                                    <w:t>_ttd</w:t>
+                                  </w:r>
+                                  <w:proofErr w:type="spellEnd"/>
+                                  <w:r>
+                                    <w:rPr>
+                                      <w:rFonts w:ascii="Tahoma" w:eastAsia="Tahoma" w:hAnsi="Tahoma" w:cs="Tahoma"/>
+                                      <w:color w:val="000000"/>
+                                      <w:sz w:val="20"/>
+                                    </w:rPr>
+                                    <w:t xml:space="preserve"> }}</w:t>
                                   </w:r>
                                 </w:p>
                                 <w:p>
@@ -2552,17 +2569,7 @@
                                       <w:sz w:val="22"/>
                                       <w:lang w:val="id-ID"/>
                                     </w:rPr>
-                                    <w:t>KOKO, S.E., M.M</w:t>
-                                  </w:r>
-                                  <w:r>
-                                    <w:rPr>
-                                      <w:rFonts w:ascii="Calibri" w:hAnsi="Calibri"/>
-                                      <w:b/>
-                                      <w:bCs/>
-                                      <w:color w:val="000000"/>
-                                      <w:sz w:val="22"/>
-                                    </w:rPr>
-                                    <w:t>.</w:t>
+                                    <w:t>{{ nama_pejabat }}</w:t>
                                   </w:r>
                                 </w:p>
                                 <w:p>
@@ -2575,13 +2582,41 @@
                                       <w:sz w:val="22"/>
                                     </w:rPr>
                                   </w:pPr>
+                                  <w:proofErr w:type="gramStart"/>
                                   <w:r>
                                     <w:rPr>
                                       <w:rFonts w:ascii="Calibri" w:hAnsi="Calibri"/>
                                       <w:color w:val="000000"/>
                                       <w:sz w:val="22"/>
                                     </w:rPr>
-                                    <w:t>Pembina</w:t>
+                                    <w:t xml:space="preserve">{{ </w:t>
+                                  </w:r>
+                                  <w:proofErr w:type="spellStart"/>
+                                  <w:r>
+                                    <w:rPr>
+                                      <w:rFonts w:ascii="Calibri" w:hAnsi="Calibri"/>
+                                      <w:color w:val="000000"/>
+                                      <w:sz w:val="22"/>
+                                    </w:rPr>
+                                    <w:t>pangkat</w:t>
+                                  </w:r>
+                                  <w:proofErr w:type="gramEnd"/>
+                                  <w:r>
+                                    <w:rPr>
+                                      <w:rFonts w:ascii="Calibri" w:hAnsi="Calibri"/>
+                                      <w:color w:val="000000"/>
+                                      <w:sz w:val="22"/>
+                                    </w:rPr>
+                                    <w:t>_pejabat</w:t>
+                                  </w:r>
+                                  <w:proofErr w:type="spellEnd"/>
+                                  <w:r>
+                                    <w:rPr>
+                                      <w:rFonts w:ascii="Calibri" w:hAnsi="Calibri"/>
+                                      <w:color w:val="000000"/>
+                                      <w:sz w:val="22"/>
+                                    </w:rPr>
+                                    <w:t xml:space="preserve"> }}</w:t>
                                   </w:r>
                                 </w:p>
                                 <w:p>
@@ -2601,7 +2636,16 @@
                                       <w:sz w:val="22"/>
                                       <w:lang w:val="id-ID"/>
                                     </w:rPr>
-                                    <w:t>NIP. 19810323 200801 1 004</w:t>
+                                    <w:t xml:space="preserve">NIP. </w:t>
+                                  </w:r>
+                                  <w:r>
+                                    <w:rPr>
+                                      <w:rFonts w:ascii="Calibri" w:hAnsi="Calibri"/>
+                                      <w:color w:val="000000"/>
+                                      <w:sz w:val="22"/>
+                                      <w:lang w:val="id-ID"/>
+                                    </w:rPr>
+                                    <w:t>{{ nip_pejabat }}</w:t>
                                   </w:r>
                                 </w:p>
                               </w:txbxContent>
@@ -2623,11 +2667,11 @@
                 </mc:Choice>
                 <mc:Fallback>
                   <w:pict>
-                    <v:shapetype w14:anchorId="5960E269" id="_x0000_t202" coordsize="21600,21600" o:spt="202" path="m,l,21600r21600,l21600,xe">
+                    <v:shapetype w14:anchorId="3A6341FC" id="_x0000_t202" coordsize="21600,21600" o:spt="202" path="m,l,21600r21600,l21600,xe">
                       <v:stroke joinstyle="miter"/>
                       <v:path gradientshapeok="t" o:connecttype="rect"/>
                     </v:shapetype>
-                    <v:shape id="TextBox 1" o:spid="_x0000_s1026" type="#_x0000_t202" style="position:absolute;left:0;text-align:left;margin-left:42.4pt;margin-top:-5.9pt;width:188.45pt;height:121.65pt;z-index:251659264;visibility:visible;mso-wrap-style:square;mso-width-percent:0;mso-height-percent:0;mso-wrap-distance-left:9pt;mso-wrap-distance-top:0;mso-wrap-distance-right:9pt;mso-wrap-distance-bottom:0;mso-position-horizontal:absolute;mso-position-horizontal-relative:text;mso-position-vertical:absolute;mso-position-vertical-relative:text;mso-width-percent:0;mso-height-percent:0;mso-width-relative:page;mso-height-relative:page;v-text-anchor:top" o:gfxdata="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" filled="f" stroked="f">
+                    <v:shape id="TextBox 1" o:spid="_x0000_s1026" type="#_x0000_t202" style="position:absolute;left:0;text-align:left;margin-left:42.4pt;margin-top:.65pt;width:188.45pt;height:121.65pt;z-index:251659264;visibility:visible;mso-wrap-style:square;mso-width-percent:0;mso-height-percent:0;mso-wrap-distance-left:9pt;mso-wrap-distance-top:0;mso-wrap-distance-right:9pt;mso-wrap-distance-bottom:0;mso-position-horizontal:absolute;mso-position-horizontal-relative:text;mso-position-vertical:absolute;mso-position-vertical-relative:text;mso-width-percent:0;mso-height-percent:0;mso-width-relative:page;mso-height-relative:page;v-text-anchor:top" o:gfxdata="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" filled="f" stroked="f">
                       <v:textbox style="mso-fit-shape-to-text:t">
                         <w:txbxContent>
                           <w:p>
@@ -2641,37 +2685,59 @@
                                 <w:sz w:val="20"/>
                               </w:rPr>
                             </w:pPr>
+                            <w:proofErr w:type="spellStart"/>
                             <w:r>
                               <w:rPr>
                                 <w:rFonts w:ascii="Tahoma" w:eastAsia="Tahoma" w:hAnsi="Tahoma" w:cs="Tahoma"/>
                                 <w:color w:val="000000"/>
                                 <w:sz w:val="20"/>
                               </w:rPr>
-                              <w:t xml:space="preserve">Cimahi, </w:t>
+                              <w:t>Cimahi</w:t>
                             </w:r>
+                            <w:proofErr w:type="spellEnd"/>
                             <w:r>
                               <w:rPr>
                                 <w:rFonts w:ascii="Tahoma" w:eastAsia="Tahoma" w:hAnsi="Tahoma" w:cs="Tahoma"/>
                                 <w:color w:val="000000"/>
                                 <w:sz w:val="20"/>
                               </w:rPr>
-                              <w:t xml:space="preserve">30 Januari </w:t>
+                              <w:t xml:space="preserve">, </w:t>
                             </w:r>
+                            <w:proofErr w:type="gramStart"/>
                             <w:r>
                               <w:rPr>
                                 <w:rFonts w:ascii="Tahoma" w:eastAsia="Tahoma" w:hAnsi="Tahoma" w:cs="Tahoma"/>
                                 <w:color w:val="000000"/>
                                 <w:sz w:val="20"/>
                               </w:rPr>
-                              <w:t>202</w:t>
+                              <w:t xml:space="preserve">{{ </w:t>
                             </w:r>
+                            <w:proofErr w:type="spellStart"/>
                             <w:r>
                               <w:rPr>
                                 <w:rFonts w:ascii="Tahoma" w:eastAsia="Tahoma" w:hAnsi="Tahoma" w:cs="Tahoma"/>
                                 <w:color w:val="000000"/>
                                 <w:sz w:val="20"/>
                               </w:rPr>
-                              <w:t>6</w:t>
+                              <w:t>tanggal</w:t>
+                            </w:r>
+                            <w:proofErr w:type="gramEnd"/>
+                            <w:r>
+                              <w:rPr>
+                                <w:rFonts w:ascii="Tahoma" w:eastAsia="Tahoma" w:hAnsi="Tahoma" w:cs="Tahoma"/>
+                                <w:color w:val="000000"/>
+                                <w:sz w:val="20"/>
+                              </w:rPr>
+                              <w:t>_ttd</w:t>
+                            </w:r>
+                            <w:proofErr w:type="spellEnd"/>
+                            <w:r>
+                              <w:rPr>
+                                <w:rFonts w:ascii="Tahoma" w:eastAsia="Tahoma" w:hAnsi="Tahoma" w:cs="Tahoma"/>
+                                <w:color w:val="000000"/>
+                                <w:sz w:val="20"/>
+                              </w:rPr>
+                              <w:t xml:space="preserve"> }}</w:t>
                             </w:r>
                           </w:p>
                           <w:p>
@@ -2786,17 +2852,7 @@
                                 <w:sz w:val="22"/>
                                 <w:lang w:val="id-ID"/>
                               </w:rPr>
-                              <w:t>KOKO, S.E., M.M</w:t>
-                            </w:r>
-                            <w:r>
-                              <w:rPr>
-                                <w:rFonts w:ascii="Calibri" w:hAnsi="Calibri"/>
-                                <w:b/>
-                                <w:bCs/>
-                                <w:color w:val="000000"/>
-                                <w:sz w:val="22"/>
-                              </w:rPr>
-                              <w:t>.</w:t>
+                              <w:t>{{ nama_pejabat }}</w:t>
                             </w:r>
                           </w:p>
                           <w:p>
@@ -2809,13 +2865,41 @@
                                 <w:sz w:val="22"/>
                               </w:rPr>
                             </w:pPr>
+                            <w:proofErr w:type="gramStart"/>
                             <w:r>
                               <w:rPr>
                                 <w:rFonts w:ascii="Calibri" w:hAnsi="Calibri"/>
                                 <w:color w:val="000000"/>
                                 <w:sz w:val="22"/>
                               </w:rPr>
-                              <w:t>Pembina</w:t>
+                              <w:t xml:space="preserve">{{ </w:t>
+                            </w:r>
+                            <w:proofErr w:type="spellStart"/>
+                            <w:r>
+                              <w:rPr>
+                                <w:rFonts w:ascii="Calibri" w:hAnsi="Calibri"/>
+                                <w:color w:val="000000"/>
+                                <w:sz w:val="22"/>
+                              </w:rPr>
+                              <w:t>pangkat</w:t>
+                            </w:r>
+                            <w:proofErr w:type="gramEnd"/>
+                            <w:r>
+                              <w:rPr>
+                                <w:rFonts w:ascii="Calibri" w:hAnsi="Calibri"/>
+                                <w:color w:val="000000"/>
+                                <w:sz w:val="22"/>
+                              </w:rPr>
+                              <w:t>_pejabat</w:t>
+                            </w:r>
+                            <w:proofErr w:type="spellEnd"/>
+                            <w:r>
+                              <w:rPr>
+                                <w:rFonts w:ascii="Calibri" w:hAnsi="Calibri"/>
+                                <w:color w:val="000000"/>
+                                <w:sz w:val="22"/>
+                              </w:rPr>
+                              <w:t xml:space="preserve"> }}</w:t>
                             </w:r>
                           </w:p>
                           <w:p>
@@ -2835,7 +2919,16 @@
                                 <w:sz w:val="22"/>
                                 <w:lang w:val="id-ID"/>
                               </w:rPr>
-                              <w:t>NIP. 19810323 200801 1 004</w:t>
+                              <w:t xml:space="preserve">NIP. </w:t>
+                            </w:r>
+                            <w:r>
+                              <w:rPr>
+                                <w:rFonts w:ascii="Calibri" w:hAnsi="Calibri"/>
+                                <w:color w:val="000000"/>
+                                <w:sz w:val="22"/>
+                                <w:lang w:val="id-ID"/>
+                              </w:rPr>
+                              <w:t>{{ nip_pejabat }}</w:t>
                             </w:r>
                           </w:p>
                         </w:txbxContent>
@@ -2870,20 +2963,7 @@
     </w:tbl>
     <w:p>
       <w:pPr>
-        <w:ind w:left="720" w:firstLine="720"/>
-        <w:outlineLvl w:val="0"/>
-        <w:rPr>
-          <w:rFonts w:ascii="Tahoma" w:hAnsi="Tahoma" w:cs="Tahoma"/>
-          <w:color w:val="000000"/>
-          <w:sz w:val="18"/>
-          <w:szCs w:val="20"/>
-        </w:rPr>
-      </w:pPr>
-    </w:p>
-    <w:p>
-      <w:pPr>
-        <w:ind w:left="720" w:firstLine="720"/>
-        <w:outlineLvl w:val="0"/>
+        <w:ind w:firstLine="450"/>
         <w:rPr>
           <w:rFonts w:ascii="Tahoma" w:hAnsi="Tahoma" w:cs="Tahoma"/>
           <w:color w:val="000000"/>
@@ -2904,7 +2984,7 @@
     <w:sectPr>
       <w:headerReference w:type="default" r:id="rId12"/>
       <w:pgSz w:w="11906" w:h="8391" w:orient="landscape" w:code="11"/>
-      <w:pgMar w:top="1361" w:right="181" w:bottom="0" w:left="181" w:header="709" w:footer="709" w:gutter="0"/>
+      <w:pgMar w:top="1418" w:right="181" w:bottom="426" w:left="181" w:header="709" w:footer="709" w:gutter="0"/>
       <w:cols w:space="708"/>
       <w:docGrid w:linePitch="360"/>
     </w:sectPr>
@@ -2913,7 +2993,7 @@
 </file>
 
 <file path=word/endnotes.xml><?xml version="1.0" encoding="utf-8"?>
-<w:endnotes xmlns:wpc="http://schemas.microsoft.com/office/word/2010/wordprocessingCanvas" xmlns:cx="http://schemas.microsoft.com/office/drawing/2014/chartex" xmlns:cx1="http://schemas.microsoft.com/office/drawing/2015/9/8/chartex" xmlns:cx2="http://schemas.microsoft.com/office/drawing/2015/10/21/chartex" xmlns:cx3="http://schemas.microsoft.com/office/drawing/2016/5/9/chartex" xmlns:cx4="http://schemas.microsoft.com/office/drawing/2016/5/10/chartex" xmlns:cx5="http://schemas.microsoft.com/office/drawing/2016/5/11/chartex" xmlns:cx6="http://schemas.microsoft.com/office/drawing/2016/5/12/chartex" xmlns:cx7="http://schemas.microsoft.com/office/drawing/2016/5/13/chartex" xmlns:cx8="http://schemas.microsoft.com/office/drawing/2016/5/14/chartex" xmlns:mc="http://schemas.openxmlformats.org/markup-compatibility/2006" xmlns:aink="http://schemas.microsoft.com/office/drawing/2016/ink" xmlns:am3d="http://schemas.microsoft.com/office/drawing/2017/model3d" xmlns:o="urn:schemas-microsoft-com:office:office" xmlns:oel="http://schemas.microsoft.com/office/2019/extlst" xmlns:r="http://schemas.openxmlformats.org/officeDocument/2006/relationships" xmlns:m="http://schemas.openxmlformats.org/officeDocument/2006/math" xmlns:v="urn:schemas-microsoft-com:vml" xmlns:wp14="http://schemas.microsoft.com/office/word/2010/wordprocessingDrawing" xmlns:wp="http://schemas.openxmlformats.org/drawingml/2006/wordprocessingDrawing" xmlns:w10="urn:schemas-microsoft-com:office:word" xmlns:w="http://schemas.openxmlformats.org/wordprocessingml/2006/main" xmlns:w14="http://schemas.microsoft.com/office/word/2010/wordml" xmlns:w15="http://schemas.microsoft.com/office/word/2012/wordml" xmlns:w16cex="http://schemas.microsoft.com/office/word/2018/wordml/cex" xmlns:w16cid="http://schemas.microsoft.com/office/word/2016/wordml/cid" xmlns:w16="http://schemas.microsoft.com/office/word/2018/wordml" xmlns:w16du="http://schemas.microsoft.com/office/word/2023/wordml/word16du" xmlns:w16sdtdh="http://schemas.microsoft.com/office/word/2020/wordml/sdtdatahash" xmlns:w16sdtfl="http://schemas.microsoft.com/office/word/2024/wordml/sdtformatlock" xmlns:w16se="http://schemas.microsoft.com/office/word/2015/wordml/symex" xmlns:wpg="http://schemas.microsoft.com/office/word/2010/wordprocessingGroup" xmlns:wpi="http://schemas.microsoft.com/office/word/2010/wordprocessingInk" xmlns:wne="http://schemas.microsoft.com/office/word/2006/wordml" xmlns:wps="http://schemas.microsoft.com/office/word/2010/wordprocessingShape" mc:Ignorable="w14 w15 w16se w16cid w16 w16cex w16sdtdh w16sdtfl w16du wp14">
+<w:endnotes xmlns:wpc="http://schemas.microsoft.com/office/word/2010/wordprocessingCanvas" xmlns:cx="http://schemas.microsoft.com/office/drawing/2014/chartex" xmlns:cx1="http://schemas.microsoft.com/office/drawing/2015/9/8/chartex" xmlns:cx2="http://schemas.microsoft.com/office/drawing/2015/10/21/chartex" xmlns:cx3="http://schemas.microsoft.com/office/drawing/2016/5/9/chartex" xmlns:cx4="http://schemas.microsoft.com/office/drawing/2016/5/10/chartex" xmlns:cx5="http://schemas.microsoft.com/office/drawing/2016/5/11/chartex" xmlns:cx6="http://schemas.microsoft.com/office/drawing/2016/5/12/chartex" xmlns:cx7="http://schemas.microsoft.com/office/drawing/2016/5/13/chartex" xmlns:cx8="http://schemas.microsoft.com/office/drawing/2016/5/14/chartex" xmlns:mc="http://schemas.openxmlformats.org/markup-compatibility/2006" xmlns:aink="http://schemas.microsoft.com/office/drawing/2016/ink" xmlns:am3d="http://schemas.microsoft.com/office/drawing/2017/model3d" xmlns:o="urn:schemas-microsoft-com:office:office" xmlns:r="http://schemas.openxmlformats.org/officeDocument/2006/relationships" xmlns:m="http://schemas.openxmlformats.org/officeDocument/2006/math" xmlns:v="urn:schemas-microsoft-com:vml" xmlns:wp14="http://schemas.microsoft.com/office/word/2010/wordprocessingDrawing" xmlns:wp="http://schemas.openxmlformats.org/drawingml/2006/wordprocessingDrawing" xmlns:w10="urn:schemas-microsoft-com:office:word" xmlns:w="http://schemas.openxmlformats.org/wordprocessingml/2006/main" xmlns:w14="http://schemas.microsoft.com/office/word/2010/wordml" xmlns:w15="http://schemas.microsoft.com/office/word/2012/wordml" xmlns:w16cex="http://schemas.microsoft.com/office/word/2018/wordml/cex" xmlns:w16cid="http://schemas.microsoft.com/office/word/2016/wordml/cid" xmlns:w16="http://schemas.microsoft.com/office/word/2018/wordml" xmlns:w16sdtdh="http://schemas.microsoft.com/office/word/2020/wordml/sdtdatahash" xmlns:w16se="http://schemas.microsoft.com/office/word/2015/wordml/symex" xmlns:wpg="http://schemas.microsoft.com/office/word/2010/wordprocessingGroup" xmlns:wpi="http://schemas.microsoft.com/office/word/2010/wordprocessingInk" xmlns:wne="http://schemas.microsoft.com/office/word/2006/wordml" xmlns:wps="http://schemas.microsoft.com/office/word/2010/wordprocessingShape" mc:Ignorable="w14 w15 w16se w16cid w16 w16cex w16sdtdh wp14">
   <w:endnote w:type="separator" w:id="-1">
     <w:p>
       <w:r>
@@ -2932,7 +3012,7 @@
 </file>
 
 <file path=word/footnotes.xml><?xml version="1.0" encoding="utf-8"?>
-<w:footnotes xmlns:wpc="http://schemas.microsoft.com/office/word/2010/wordprocessingCanvas" xmlns:cx="http://schemas.microsoft.com/office/drawing/2014/chartex" xmlns:cx1="http://schemas.microsoft.com/office/drawing/2015/9/8/chartex" xmlns:cx2="http://schemas.microsoft.com/office/drawing/2015/10/21/chartex" xmlns:cx3="http://schemas.microsoft.com/office/drawing/2016/5/9/chartex" xmlns:cx4="http://schemas.microsoft.com/office/drawing/2016/5/10/chartex" xmlns:cx5="http://schemas.microsoft.com/office/drawing/2016/5/11/chartex" xmlns:cx6="http://schemas.microsoft.com/office/drawing/2016/5/12/chartex" xmlns:cx7="http://schemas.microsoft.com/office/drawing/2016/5/13/chartex" xmlns:cx8="http://schemas.microsoft.com/office/drawing/2016/5/14/chartex" xmlns:mc="http://schemas.openxmlformats.org/markup-compatibility/2006" xmlns:aink="http://schemas.microsoft.com/office/drawing/2016/ink" xmlns:am3d="http://schemas.microsoft.com/office/drawing/2017/model3d" xmlns:o="urn:schemas-microsoft-com:office:office" xmlns:oel="http://schemas.microsoft.com/office/2019/extlst" xmlns:r="http://schemas.openxmlformats.org/officeDocument/2006/relationships" xmlns:m="http://schemas.openxmlformats.org/officeDocument/2006/math" xmlns:v="urn:schemas-microsoft-com:vml" xmlns:wp14="http://schemas.microsoft.com/office/word/2010/wordprocessingDrawing" xmlns:wp="http://schemas.openxmlformats.org/drawingml/2006/wordprocessingDrawing" xmlns:w10="urn:schemas-microsoft-com:office:word" xmlns:w="http://schemas.openxmlformats.org/wordprocessingml/2006/main" xmlns:w14="http://schemas.microsoft.com/office/word/2010/wordml" xmlns:w15="http://schemas.microsoft.com/office/word/2012/wordml" xmlns:w16cex="http://schemas.microsoft.com/office/word/2018/wordml/cex" xmlns:w16cid="http://schemas.microsoft.com/office/word/2016/wordml/cid" xmlns:w16="http://schemas.microsoft.com/office/word/2018/wordml" xmlns:w16du="http://schemas.microsoft.com/office/word/2023/wordml/word16du" xmlns:w16sdtdh="http://schemas.microsoft.com/office/word/2020/wordml/sdtdatahash" xmlns:w16sdtfl="http://schemas.microsoft.com/office/word/2024/wordml/sdtformatlock" xmlns:w16se="http://schemas.microsoft.com/office/word/2015/wordml/symex" xmlns:wpg="http://schemas.microsoft.com/office/word/2010/wordprocessingGroup" xmlns:wpi="http://schemas.microsoft.com/office/word/2010/wordprocessingInk" xmlns:wne="http://schemas.microsoft.com/office/word/2006/wordml" xmlns:wps="http://schemas.microsoft.com/office/word/2010/wordprocessingShape" mc:Ignorable="w14 w15 w16se w16cid w16 w16cex w16sdtdh w16sdtfl w16du wp14">
+<w:footnotes xmlns:wpc="http://schemas.microsoft.com/office/word/2010/wordprocessingCanvas" xmlns:cx="http://schemas.microsoft.com/office/drawing/2014/chartex" xmlns:cx1="http://schemas.microsoft.com/office/drawing/2015/9/8/chartex" xmlns:cx2="http://schemas.microsoft.com/office/drawing/2015/10/21/chartex" xmlns:cx3="http://schemas.microsoft.com/office/drawing/2016/5/9/chartex" xmlns:cx4="http://schemas.microsoft.com/office/drawing/2016/5/10/chartex" xmlns:cx5="http://schemas.microsoft.com/office/drawing/2016/5/11/chartex" xmlns:cx6="http://schemas.microsoft.com/office/drawing/2016/5/12/chartex" xmlns:cx7="http://schemas.microsoft.com/office/drawing/2016/5/13/chartex" xmlns:cx8="http://schemas.microsoft.com/office/drawing/2016/5/14/chartex" xmlns:mc="http://schemas.openxmlformats.org/markup-compatibility/2006" xmlns:aink="http://schemas.microsoft.com/office/drawing/2016/ink" xmlns:am3d="http://schemas.microsoft.com/office/drawing/2017/model3d" xmlns:o="urn:schemas-microsoft-com:office:office" xmlns:r="http://schemas.openxmlformats.org/officeDocument/2006/relationships" xmlns:m="http://schemas.openxmlformats.org/officeDocument/2006/math" xmlns:v="urn:schemas-microsoft-com:vml" xmlns:wp14="http://schemas.microsoft.com/office/word/2010/wordprocessingDrawing" xmlns:wp="http://schemas.openxmlformats.org/drawingml/2006/wordprocessingDrawing" xmlns:w10="urn:schemas-microsoft-com:office:word" xmlns:w="http://schemas.openxmlformats.org/wordprocessingml/2006/main" xmlns:w14="http://schemas.microsoft.com/office/word/2010/wordml" xmlns:w15="http://schemas.microsoft.com/office/word/2012/wordml" xmlns:w16cex="http://schemas.microsoft.com/office/word/2018/wordml/cex" xmlns:w16cid="http://schemas.microsoft.com/office/word/2016/wordml/cid" xmlns:w16="http://schemas.microsoft.com/office/word/2018/wordml" xmlns:w16sdtdh="http://schemas.microsoft.com/office/word/2020/wordml/sdtdatahash" xmlns:w16se="http://schemas.microsoft.com/office/word/2015/wordml/symex" xmlns:wpg="http://schemas.microsoft.com/office/word/2010/wordprocessingGroup" xmlns:wpi="http://schemas.microsoft.com/office/word/2010/wordprocessingInk" xmlns:wne="http://schemas.microsoft.com/office/word/2006/wordml" xmlns:wps="http://schemas.microsoft.com/office/word/2010/wordprocessingShape" mc:Ignorable="w14 w15 w16se w16cid w16 w16cex w16sdtdh wp14">
   <w:footnote w:type="separator" w:id="-1">
     <w:p>
       <w:r>
@@ -2951,7 +3031,7 @@
 </file>
 
 <file path=word/header1.xml><?xml version="1.0" encoding="utf-8"?>
-<w:hdr xmlns:wpc="http://schemas.microsoft.com/office/word/2010/wordprocessingCanvas" xmlns:cx="http://schemas.microsoft.com/office/drawing/2014/chartex" xmlns:cx1="http://schemas.microsoft.com/office/drawing/2015/9/8/chartex" xmlns:cx2="http://schemas.microsoft.com/office/drawing/2015/10/21/chartex" xmlns:cx3="http://schemas.microsoft.com/office/drawing/2016/5/9/chartex" xmlns:cx4="http://schemas.microsoft.com/office/drawing/2016/5/10/chartex" xmlns:cx5="http://schemas.microsoft.com/office/drawing/2016/5/11/chartex" xmlns:cx6="http://schemas.microsoft.com/office/drawing/2016/5/12/chartex" xmlns:cx7="http://schemas.microsoft.com/office/drawing/2016/5/13/chartex" xmlns:cx8="http://schemas.microsoft.com/office/drawing/2016/5/14/chartex" xmlns:mc="http://schemas.openxmlformats.org/markup-compatibility/2006" xmlns:aink="http://schemas.microsoft.com/office/drawing/2016/ink" xmlns:am3d="http://schemas.microsoft.com/office/drawing/2017/model3d" xmlns:o="urn:schemas-microsoft-com:office:office" xmlns:oel="http://schemas.microsoft.com/office/2019/extlst" xmlns:r="http://schemas.openxmlformats.org/officeDocument/2006/relationships" xmlns:m="http://schemas.openxmlformats.org/officeDocument/2006/math" xmlns:v="urn:schemas-microsoft-com:vml" xmlns:wp14="http://schemas.microsoft.com/office/word/2010/wordprocessingDrawing" xmlns:wp="http://schemas.openxmlformats.org/drawingml/2006/wordprocessingDrawing" xmlns:w10="urn:schemas-microsoft-com:office:word" xmlns:w="http://schemas.openxmlformats.org/wordprocessingml/2006/main" xmlns:w14="http://schemas.microsoft.com/office/word/2010/wordml" xmlns:w15="http://schemas.microsoft.com/office/word/2012/wordml" xmlns:w16cex="http://schemas.microsoft.com/office/word/2018/wordml/cex" xmlns:w16cid="http://schemas.microsoft.com/office/word/2016/wordml/cid" xmlns:w16="http://schemas.microsoft.com/office/word/2018/wordml" xmlns:w16du="http://schemas.microsoft.com/office/word/2023/wordml/word16du" xmlns:w16sdtdh="http://schemas.microsoft.com/office/word/2020/wordml/sdtdatahash" xmlns:w16sdtfl="http://schemas.microsoft.com/office/word/2024/wordml/sdtformatlock" xmlns:w16se="http://schemas.microsoft.com/office/word/2015/wordml/symex" xmlns:wpg="http://schemas.microsoft.com/office/word/2010/wordprocessingGroup" xmlns:wpi="http://schemas.microsoft.com/office/word/2010/wordprocessingInk" xmlns:wne="http://schemas.microsoft.com/office/word/2006/wordml" xmlns:wps="http://schemas.microsoft.com/office/word/2010/wordprocessingShape" mc:Ignorable="w14 w15 w16se w16cid w16 w16cex w16sdtdh w16sdtfl w16du wp14">
+<w:hdr xmlns:wpc="http://schemas.microsoft.com/office/word/2010/wordprocessingCanvas" xmlns:cx="http://schemas.microsoft.com/office/drawing/2014/chartex" xmlns:cx1="http://schemas.microsoft.com/office/drawing/2015/9/8/chartex" xmlns:cx2="http://schemas.microsoft.com/office/drawing/2015/10/21/chartex" xmlns:cx3="http://schemas.microsoft.com/office/drawing/2016/5/9/chartex" xmlns:cx4="http://schemas.microsoft.com/office/drawing/2016/5/10/chartex" xmlns:cx5="http://schemas.microsoft.com/office/drawing/2016/5/11/chartex" xmlns:cx6="http://schemas.microsoft.com/office/drawing/2016/5/12/chartex" xmlns:cx7="http://schemas.microsoft.com/office/drawing/2016/5/13/chartex" xmlns:cx8="http://schemas.microsoft.com/office/drawing/2016/5/14/chartex" xmlns:mc="http://schemas.openxmlformats.org/markup-compatibility/2006" xmlns:aink="http://schemas.microsoft.com/office/drawing/2016/ink" xmlns:am3d="http://schemas.microsoft.com/office/drawing/2017/model3d" xmlns:o="urn:schemas-microsoft-com:office:office" xmlns:r="http://schemas.openxmlformats.org/officeDocument/2006/relationships" xmlns:m="http://schemas.openxmlformats.org/officeDocument/2006/math" xmlns:v="urn:schemas-microsoft-com:vml" xmlns:wp14="http://schemas.microsoft.com/office/word/2010/wordprocessingDrawing" xmlns:wp="http://schemas.openxmlformats.org/drawingml/2006/wordprocessingDrawing" xmlns:w10="urn:schemas-microsoft-com:office:word" xmlns:w="http://schemas.openxmlformats.org/wordprocessingml/2006/main" xmlns:w14="http://schemas.microsoft.com/office/word/2010/wordml" xmlns:w15="http://schemas.microsoft.com/office/word/2012/wordml" xmlns:w16cex="http://schemas.microsoft.com/office/word/2018/wordml/cex" xmlns:w16cid="http://schemas.microsoft.com/office/word/2016/wordml/cid" xmlns:w16="http://schemas.microsoft.com/office/word/2018/wordml" xmlns:w16sdtdh="http://schemas.microsoft.com/office/word/2020/wordml/sdtdatahash" xmlns:w16se="http://schemas.microsoft.com/office/word/2015/wordml/symex" xmlns:wpg="http://schemas.microsoft.com/office/word/2010/wordprocessingGroup" xmlns:wpi="http://schemas.microsoft.com/office/word/2010/wordprocessingInk" xmlns:wne="http://schemas.microsoft.com/office/word/2006/wordml" xmlns:wps="http://schemas.microsoft.com/office/word/2010/wordprocessingShape" mc:Ignorable="w14 w15 w16se w16cid w16 w16cex w16sdtdh wp14">
   <w:p>
     <w:pPr>
       <w:pStyle w:val="Header"/>
@@ -2972,7 +3052,7 @@
 </file>
 
 <file path=word/numbering.xml><?xml version="1.0" encoding="utf-8"?>
-<w:numbering xmlns:wpc="http://schemas.microsoft.com/office/word/2010/wordprocessingCanvas" xmlns:cx="http://schemas.microsoft.com/office/drawing/2014/chartex" xmlns:cx1="http://schemas.microsoft.com/office/drawing/2015/9/8/chartex" xmlns:cx2="http://schemas.microsoft.com/office/drawing/2015/10/21/chartex" xmlns:cx3="http://schemas.microsoft.com/office/drawing/2016/5/9/chartex" xmlns:cx4="http://schemas.microsoft.com/office/drawing/2016/5/10/chartex" xmlns:cx5="http://schemas.microsoft.com/office/drawing/2016/5/11/chartex" xmlns:cx6="http://schemas.microsoft.com/office/drawing/2016/5/12/chartex" xmlns:cx7="http://schemas.microsoft.com/office/drawing/2016/5/13/chartex" xmlns:cx8="http://schemas.microsoft.com/office/drawing/2016/5/14/chartex" xmlns:mc="http://schemas.openxmlformats.org/markup-compatibility/2006" xmlns:aink="http://schemas.microsoft.com/office/drawing/2016/ink" xmlns:am3d="http://schemas.microsoft.com/office/drawing/2017/model3d" xmlns:o="urn:schemas-microsoft-com:office:office" xmlns:oel="http://schemas.microsoft.com/office/2019/extlst" xmlns:r="http://schemas.openxmlformats.org/officeDocument/2006/relationships" xmlns:m="http://schemas.openxmlformats.org/officeDocument/2006/math" xmlns:v="urn:schemas-microsoft-com:vml" xmlns:wp14="http://schemas.microsoft.com/office/word/2010/wordprocessingDrawing" xmlns:wp="http://schemas.openxmlformats.org/drawingml/2006/wordprocessingDrawing" xmlns:w10="urn:schemas-microsoft-com:office:word" xmlns:w="http://schemas.openxmlformats.org/wordprocessingml/2006/main" xmlns:w14="http://schemas.microsoft.com/office/word/2010/wordml" xmlns:w15="http://schemas.microsoft.com/office/word/2012/wordml" xmlns:w16cex="http://schemas.microsoft.com/office/word/2018/wordml/cex" xmlns:w16cid="http://schemas.microsoft.com/office/word/2016/wordml/cid" xmlns:w16="http://schemas.microsoft.com/office/word/2018/wordml" xmlns:w16du="http://schemas.microsoft.com/office/word/2023/wordml/word16du" xmlns:w16sdtdh="http://schemas.microsoft.com/office/word/2020/wordml/sdtdatahash" xmlns:w16sdtfl="http://schemas.microsoft.com/office/word/2024/wordml/sdtformatlock" xmlns:w16se="http://schemas.microsoft.com/office/word/2015/wordml/symex" xmlns:wpg="http://schemas.microsoft.com/office/word/2010/wordprocessingGroup" xmlns:wpi="http://schemas.microsoft.com/office/word/2010/wordprocessingInk" xmlns:wne="http://schemas.microsoft.com/office/word/2006/wordml" xmlns:wps="http://schemas.microsoft.com/office/word/2010/wordprocessingShape" mc:Ignorable="w14 w15 w16se w16cid w16 w16cex w16sdtdh w16sdtfl w16du wp14">
+<w:numbering xmlns:wpc="http://schemas.microsoft.com/office/word/2010/wordprocessingCanvas" xmlns:cx="http://schemas.microsoft.com/office/drawing/2014/chartex" xmlns:cx1="http://schemas.microsoft.com/office/drawing/2015/9/8/chartex" xmlns:cx2="http://schemas.microsoft.com/office/drawing/2015/10/21/chartex" xmlns:cx3="http://schemas.microsoft.com/office/drawing/2016/5/9/chartex" xmlns:cx4="http://schemas.microsoft.com/office/drawing/2016/5/10/chartex" xmlns:cx5="http://schemas.microsoft.com/office/drawing/2016/5/11/chartex" xmlns:cx6="http://schemas.microsoft.com/office/drawing/2016/5/12/chartex" xmlns:cx7="http://schemas.microsoft.com/office/drawing/2016/5/13/chartex" xmlns:cx8="http://schemas.microsoft.com/office/drawing/2016/5/14/chartex" xmlns:mc="http://schemas.openxmlformats.org/markup-compatibility/2006" xmlns:aink="http://schemas.microsoft.com/office/drawing/2016/ink" xmlns:am3d="http://schemas.microsoft.com/office/drawing/2017/model3d" xmlns:o="urn:schemas-microsoft-com:office:office" xmlns:r="http://schemas.openxmlformats.org/officeDocument/2006/relationships" xmlns:m="http://schemas.openxmlformats.org/officeDocument/2006/math" xmlns:v="urn:schemas-microsoft-com:vml" xmlns:wp14="http://schemas.microsoft.com/office/word/2010/wordprocessingDrawing" xmlns:wp="http://schemas.openxmlformats.org/drawingml/2006/wordprocessingDrawing" xmlns:w10="urn:schemas-microsoft-com:office:word" xmlns:w="http://schemas.openxmlformats.org/wordprocessingml/2006/main" xmlns:w14="http://schemas.microsoft.com/office/word/2010/wordml" xmlns:w15="http://schemas.microsoft.com/office/word/2012/wordml" xmlns:w16cex="http://schemas.microsoft.com/office/word/2018/wordml/cex" xmlns:w16cid="http://schemas.microsoft.com/office/word/2016/wordml/cid" xmlns:w16="http://schemas.microsoft.com/office/word/2018/wordml" xmlns:w16sdtdh="http://schemas.microsoft.com/office/word/2020/wordml/sdtdatahash" xmlns:w16se="http://schemas.microsoft.com/office/word/2015/wordml/symex" xmlns:wpg="http://schemas.microsoft.com/office/word/2010/wordprocessingGroup" xmlns:wpi="http://schemas.microsoft.com/office/word/2010/wordprocessingInk" xmlns:wne="http://schemas.microsoft.com/office/word/2006/wordml" xmlns:wps="http://schemas.microsoft.com/office/word/2010/wordprocessingShape" mc:Ignorable="w14 w15 w16se w16cid w16 w16cex w16sdtdh wp14">
   <w:abstractNum w:abstractNumId="0" w15:restartNumberingAfterBreak="0">
     <w:nsid w:val="17024A34"/>
     <w:multiLevelType w:val="hybridMultilevel"/>
@@ -4146,47 +4226,47 @@
       </w:pPr>
     </w:lvl>
   </w:abstractNum>
-  <w:num w:numId="1" w16cid:durableId="653948394">
+  <w:num w:numId="1">
     <w:abstractNumId w:val="6"/>
   </w:num>
-  <w:num w:numId="2" w16cid:durableId="1626546981">
+  <w:num w:numId="2">
     <w:abstractNumId w:val="9"/>
   </w:num>
-  <w:num w:numId="3" w16cid:durableId="38944429">
+  <w:num w:numId="3">
     <w:abstractNumId w:val="1"/>
   </w:num>
-  <w:num w:numId="4" w16cid:durableId="794101651">
+  <w:num w:numId="4">
     <w:abstractNumId w:val="5"/>
   </w:num>
-  <w:num w:numId="5" w16cid:durableId="1241989710">
+  <w:num w:numId="5">
     <w:abstractNumId w:val="7"/>
   </w:num>
-  <w:num w:numId="6" w16cid:durableId="2068607788">
+  <w:num w:numId="6">
     <w:abstractNumId w:val="8"/>
   </w:num>
-  <w:num w:numId="7" w16cid:durableId="1041589987">
+  <w:num w:numId="7">
     <w:abstractNumId w:val="4"/>
   </w:num>
-  <w:num w:numId="8" w16cid:durableId="1294947113">
+  <w:num w:numId="8">
     <w:abstractNumId w:val="0"/>
   </w:num>
-  <w:num w:numId="9" w16cid:durableId="385832966">
+  <w:num w:numId="9">
     <w:abstractNumId w:val="2"/>
   </w:num>
-  <w:num w:numId="10" w16cid:durableId="622885072">
+  <w:num w:numId="10">
     <w:abstractNumId w:val="10"/>
   </w:num>
-  <w:num w:numId="11" w16cid:durableId="236257591">
+  <w:num w:numId="11">
     <w:abstractNumId w:val="3"/>
   </w:num>
-  <w:num w:numId="12" w16cid:durableId="1086072017">
+  <w:num w:numId="12">
     <w:abstractNumId w:val="11"/>
   </w:num>
 </w:numbering>
 </file>
 
 <file path=word/styles.xml><?xml version="1.0" encoding="utf-8"?>
-<w:styles xmlns:mc="http://schemas.openxmlformats.org/markup-compatibility/2006" xmlns:r="http://schemas.openxmlformats.org/officeDocument/2006/relationships" xmlns:w="http://schemas.openxmlformats.org/wordprocessingml/2006/main" xmlns:w14="http://schemas.microsoft.com/office/word/2010/wordml" xmlns:w15="http://schemas.microsoft.com/office/word/2012/wordml" xmlns:w16cex="http://schemas.microsoft.com/office/word/2018/wordml/cex" xmlns:w16cid="http://schemas.microsoft.com/office/word/2016/wordml/cid" xmlns:w16="http://schemas.microsoft.com/office/word/2018/wordml" xmlns:w16du="http://schemas.microsoft.com/office/word/2023/wordml/word16du" xmlns:w16sdtdh="http://schemas.microsoft.com/office/word/2020/wordml/sdtdatahash" xmlns:w16sdtfl="http://schemas.microsoft.com/office/word/2024/wordml/sdtformatlock" xmlns:w16se="http://schemas.microsoft.com/office/word/2015/wordml/symex" mc:Ignorable="w14 w15 w16se w16cid w16 w16cex w16sdtdh w16sdtfl w16du">
+<w:styles xmlns:mc="http://schemas.openxmlformats.org/markup-compatibility/2006" xmlns:r="http://schemas.openxmlformats.org/officeDocument/2006/relationships" xmlns:w="http://schemas.openxmlformats.org/wordprocessingml/2006/main" xmlns:w14="http://schemas.microsoft.com/office/word/2010/wordml" xmlns:w15="http://schemas.microsoft.com/office/word/2012/wordml" xmlns:w16cex="http://schemas.microsoft.com/office/word/2018/wordml/cex" xmlns:w16cid="http://schemas.microsoft.com/office/word/2016/wordml/cid" xmlns:w16="http://schemas.microsoft.com/office/word/2018/wordml" xmlns:w16sdtdh="http://schemas.microsoft.com/office/word/2020/wordml/sdtdatahash" xmlns:w16se="http://schemas.microsoft.com/office/word/2015/wordml/symex" mc:Ignorable="w14 w15 w16se w16cid w16 w16cex w16sdtdh">
   <w:docDefaults>
     <w:rPrDefault>
       <w:rPr>

</xml_diff>